<commit_message>
Updated the logbook file and the edit.php
</commit_message>
<xml_diff>
--- a/Week 6/LOGBOOK/Log Book.docx
+++ b/Week 6/LOGBOOK/Log Book.docx
@@ -5284,9 +5284,6 @@
         <w:br/>
       </w:r>
     </w:p>
-    <w:bookmarkStart w:id="26" w:name="_Toc231513263"/>
-    <w:bookmarkStart w:id="27" w:name="_Toc231513612"/>
-    <w:bookmarkStart w:id="28" w:name="_Toc232162129"/>
     <w:p>
       <w:pPr>
         <w:spacing w:before="100" w:beforeAutospacing="1" w:after="100" w:afterAutospacing="1" w:line="240" w:lineRule="auto"/>
@@ -5299,6 +5296,9 @@
           <w:szCs w:val="27"/>
         </w:rPr>
       </w:pPr>
+      <w:bookmarkStart w:id="26" w:name="_Toc231513263"/>
+      <w:bookmarkStart w:id="27" w:name="_Toc231513612"/>
+      <w:bookmarkStart w:id="28" w:name="_Toc232162129"/>
       <w:r>
         <w:rPr>
           <w:rFonts w:ascii="Times New Roman" w:hAnsi="Times New Roman" w:cs="Times New Roman"/>
@@ -5350,25 +5350,45 @@
                             <w:r>
                               <w:t xml:space="preserve">Figure </w:t>
                             </w:r>
-                            <w:fldSimple w:instr=" STYLEREF 1 \s ">
-                              <w:r>
-                                <w:rPr>
-                                  <w:noProof/>
-                                </w:rPr>
-                                <w:t>0</w:t>
-                              </w:r>
-                            </w:fldSimple>
+                            <w:r>
+                              <w:fldChar w:fldCharType="begin"/>
+                            </w:r>
+                            <w:r>
+                              <w:instrText xml:space="preserve"> STYLEREF 1 \s </w:instrText>
+                            </w:r>
+                            <w:r>
+                              <w:fldChar w:fldCharType="separate"/>
+                            </w:r>
+                            <w:r>
+                              <w:rPr>
+                                <w:noProof/>
+                              </w:rPr>
+                              <w:t>0</w:t>
+                            </w:r>
+                            <w:r>
+                              <w:fldChar w:fldCharType="end"/>
+                            </w:r>
                             <w:r>
                               <w:noBreakHyphen/>
                             </w:r>
-                            <w:fldSimple w:instr=" SEQ Figure \* ARABIC \s 1 ">
-                              <w:r>
-                                <w:rPr>
-                                  <w:noProof/>
-                                </w:rPr>
-                                <w:t>2</w:t>
-                              </w:r>
-                            </w:fldSimple>
+                            <w:r>
+                              <w:fldChar w:fldCharType="begin"/>
+                            </w:r>
+                            <w:r>
+                              <w:instrText xml:space="preserve"> SEQ Figure \* ARABIC \s 1 </w:instrText>
+                            </w:r>
+                            <w:r>
+                              <w:fldChar w:fldCharType="separate"/>
+                            </w:r>
+                            <w:r>
+                              <w:rPr>
+                                <w:noProof/>
+                              </w:rPr>
+                              <w:t>2</w:t>
+                            </w:r>
+                            <w:r>
+                              <w:fldChar w:fldCharType="end"/>
+                            </w:r>
                             <w:r>
                               <w:t>:Admin Dashboard</w:t>
                             </w:r>
@@ -5503,9 +5523,9 @@
           <w:rFonts w:ascii="Times New Roman" w:hAnsi="Times New Roman" w:cs="Times New Roman"/>
         </w:rPr>
       </w:pPr>
-      <w:bookmarkStart w:id="30" w:name="_Toc231513264"/>
-      <w:bookmarkStart w:id="31" w:name="_Toc232161896"/>
-      <w:bookmarkStart w:id="32" w:name="_Toc232162130"/>
+      <w:bookmarkStart w:id="31" w:name="_Toc231513264"/>
+      <w:bookmarkStart w:id="32" w:name="_Toc232161896"/>
+      <w:bookmarkStart w:id="33" w:name="_Toc232162130"/>
       <w:r>
         <w:rPr>
           <w:rFonts w:ascii="Times New Roman" w:eastAsia="Times New Roman" w:hAnsi="Times New Roman" w:cs="Times New Roman"/>
@@ -5565,9 +5585,9 @@
           </wp:inline>
         </w:drawing>
       </w:r>
-      <w:bookmarkEnd w:id="30"/>
       <w:bookmarkEnd w:id="31"/>
       <w:bookmarkEnd w:id="32"/>
+      <w:bookmarkEnd w:id="33"/>
     </w:p>
     <w:p>
       <w:pPr>
@@ -5576,7 +5596,7 @@
           <w:rFonts w:ascii="Times New Roman" w:hAnsi="Times New Roman" w:cs="Times New Roman"/>
         </w:rPr>
       </w:pPr>
-      <w:bookmarkStart w:id="33" w:name="_Toc231513513"/>
+      <w:bookmarkStart w:id="34" w:name="_Toc231513513"/>
       <w:r>
         <w:rPr>
           <w:rFonts w:ascii="Times New Roman" w:hAnsi="Times New Roman" w:cs="Times New Roman"/>
@@ -5657,7 +5677,7 @@
         </w:rPr>
         <w:t>:Users Order View</w:t>
       </w:r>
-      <w:bookmarkEnd w:id="33"/>
+      <w:bookmarkEnd w:id="34"/>
       <w:r>
         <w:rPr>
           <w:rFonts w:ascii="Times New Roman" w:eastAsia="Times New Roman" w:hAnsi="Times New Roman" w:cs="Times New Roman"/>
@@ -6153,7 +6173,7 @@
           <w:szCs w:val="24"/>
         </w:rPr>
       </w:pPr>
-      <w:bookmarkStart w:id="34" w:name="_Toc232162131"/>
+      <w:bookmarkStart w:id="35" w:name="_Toc232162131"/>
       <w:r>
         <w:rPr>
           <w:rFonts w:ascii="Times New Roman" w:eastAsia="Times New Roman" w:hAnsi="Times New Roman" w:cs="Times New Roman"/>
@@ -6255,7 +6275,7 @@
         </w:rPr>
         <w:t>. I’ve experienced multiple errors while translating the Figma design to code,currently working with a mockup.</w:t>
       </w:r>
-      <w:bookmarkEnd w:id="34"/>
+      <w:bookmarkEnd w:id="35"/>
       <w:r>
         <w:rPr>
           <w:rFonts w:ascii="Times New Roman" w:eastAsia="Times New Roman" w:hAnsi="Times New Roman" w:cs="Times New Roman"/>
@@ -6296,7 +6316,7 @@
           <w:u w:val="single"/>
         </w:rPr>
       </w:pPr>
-      <w:bookmarkStart w:id="35" w:name="_Toc232162132"/>
+      <w:bookmarkStart w:id="36" w:name="_Toc232162132"/>
       <w:r>
         <w:rPr>
           <w:rFonts w:ascii="Times New Roman" w:eastAsia="Times New Roman" w:hAnsi="Times New Roman" w:cs="Times New Roman"/>
@@ -6319,7 +6339,7 @@
         </w:rPr>
         <w:t>Basics</w:t>
       </w:r>
-      <w:bookmarkEnd w:id="35"/>
+      <w:bookmarkEnd w:id="36"/>
     </w:p>
     <w:p>
       <w:pPr>
@@ -6333,7 +6353,7 @@
           <w:u w:val="single"/>
         </w:rPr>
       </w:pPr>
-      <w:bookmarkStart w:id="36" w:name="_Toc232162133"/>
+      <w:bookmarkStart w:id="37" w:name="_Toc232162133"/>
       <w:r>
         <w:rPr>
           <w:rFonts w:ascii="Times New Roman" w:eastAsia="Times New Roman" w:hAnsi="Times New Roman" w:cs="Times New Roman"/>
@@ -6378,7 +6398,7 @@
         </w:rPr>
         <w:t>eraction and Backend Foundation</w:t>
       </w:r>
-      <w:bookmarkEnd w:id="36"/>
+      <w:bookmarkEnd w:id="37"/>
     </w:p>
     <w:p>
       <w:pPr>
@@ -6389,10 +6409,10 @@
           <w:rFonts w:ascii="Times New Roman" w:hAnsi="Times New Roman" w:cs="Times New Roman"/>
         </w:rPr>
       </w:pPr>
-      <w:bookmarkStart w:id="37" w:name="_Toc231513270"/>
-      <w:bookmarkStart w:id="38" w:name="_Toc231513619"/>
-      <w:bookmarkStart w:id="39" w:name="_Toc232161900"/>
-      <w:bookmarkStart w:id="40" w:name="_Toc232162134"/>
+      <w:bookmarkStart w:id="38" w:name="_Toc231513270"/>
+      <w:bookmarkStart w:id="39" w:name="_Toc231513619"/>
+      <w:bookmarkStart w:id="40" w:name="_Toc232161900"/>
+      <w:bookmarkStart w:id="41" w:name="_Toc232162134"/>
       <w:r>
         <w:rPr>
           <w:rFonts w:ascii="Times New Roman" w:eastAsia="Times New Roman" w:hAnsi="Times New Roman" w:cs="Times New Roman"/>
@@ -6438,10 +6458,10 @@
           </wp:inline>
         </w:drawing>
       </w:r>
-      <w:bookmarkEnd w:id="37"/>
       <w:bookmarkEnd w:id="38"/>
       <w:bookmarkEnd w:id="39"/>
       <w:bookmarkEnd w:id="40"/>
+      <w:bookmarkEnd w:id="41"/>
     </w:p>
     <w:p>
       <w:pPr>
@@ -6454,7 +6474,7 @@
           <w:szCs w:val="36"/>
         </w:rPr>
       </w:pPr>
-      <w:bookmarkStart w:id="41" w:name="_Toc231513514"/>
+      <w:bookmarkStart w:id="42" w:name="_Toc231513514"/>
       <w:r>
         <w:rPr>
           <w:rFonts w:ascii="Times New Roman" w:hAnsi="Times New Roman" w:cs="Times New Roman"/>
@@ -6535,7 +6555,7 @@
         </w:rPr>
         <w:t>:JavaScript Form Validation</w:t>
       </w:r>
-      <w:bookmarkEnd w:id="41"/>
+      <w:bookmarkEnd w:id="42"/>
     </w:p>
     <w:p>
       <w:pPr>
@@ -6613,7 +6633,7 @@
           <w:rFonts w:ascii="Times New Roman" w:hAnsi="Times New Roman" w:cs="Times New Roman"/>
         </w:rPr>
       </w:pPr>
-      <w:bookmarkStart w:id="42" w:name="_Toc231513515"/>
+      <w:bookmarkStart w:id="43" w:name="_Toc231513515"/>
       <w:r>
         <w:rPr>
           <w:rFonts w:ascii="Times New Roman" w:hAnsi="Times New Roman" w:cs="Times New Roman"/>
@@ -6700,7 +6720,7 @@
         </w:rPr>
         <w:t>validation.</w:t>
       </w:r>
-      <w:bookmarkEnd w:id="42"/>
+      <w:bookmarkEnd w:id="43"/>
     </w:p>
     <w:p>
       <w:pPr>
@@ -6758,10 +6778,10 @@
         </w:rPr>
         <w:br/>
       </w:r>
-      <w:bookmarkStart w:id="43" w:name="_Toc231513271"/>
-      <w:bookmarkStart w:id="44" w:name="_Toc231513620"/>
-      <w:bookmarkStart w:id="45" w:name="_Toc232161901"/>
-      <w:bookmarkStart w:id="46" w:name="_Toc232162135"/>
+      <w:bookmarkStart w:id="44" w:name="_Toc231513271"/>
+      <w:bookmarkStart w:id="45" w:name="_Toc231513620"/>
+      <w:bookmarkStart w:id="46" w:name="_Toc232161901"/>
+      <w:bookmarkStart w:id="47" w:name="_Toc232162135"/>
       <w:r>
         <w:rPr>
           <w:rFonts w:ascii="Times New Roman" w:eastAsia="Times New Roman" w:hAnsi="Times New Roman" w:cs="Times New Roman"/>
@@ -6807,10 +6827,10 @@
           </wp:inline>
         </w:drawing>
       </w:r>
-      <w:bookmarkEnd w:id="43"/>
       <w:bookmarkEnd w:id="44"/>
       <w:bookmarkEnd w:id="45"/>
       <w:bookmarkEnd w:id="46"/>
+      <w:bookmarkEnd w:id="47"/>
     </w:p>
     <w:p>
       <w:pPr>
@@ -6819,7 +6839,7 @@
           <w:rFonts w:ascii="Times New Roman" w:hAnsi="Times New Roman" w:cs="Times New Roman"/>
         </w:rPr>
       </w:pPr>
-      <w:bookmarkStart w:id="47" w:name="_Toc231513516"/>
+      <w:bookmarkStart w:id="48" w:name="_Toc231513516"/>
       <w:r>
         <w:rPr>
           <w:rFonts w:ascii="Times New Roman" w:hAnsi="Times New Roman" w:cs="Times New Roman"/>
@@ -6900,7 +6920,7 @@
         </w:rPr>
         <w:t>:Password checker code</w:t>
       </w:r>
-      <w:bookmarkEnd w:id="47"/>
+      <w:bookmarkEnd w:id="48"/>
     </w:p>
     <w:p>
       <w:pPr>
@@ -6922,10 +6942,10 @@
         <w:lastRenderedPageBreak/>
         <w:br/>
       </w:r>
-      <w:bookmarkStart w:id="48" w:name="_Toc231513272"/>
-      <w:bookmarkStart w:id="49" w:name="_Toc231513621"/>
-      <w:bookmarkStart w:id="50" w:name="_Toc232161902"/>
-      <w:bookmarkStart w:id="51" w:name="_Toc232162136"/>
+      <w:bookmarkStart w:id="49" w:name="_Toc231513272"/>
+      <w:bookmarkStart w:id="50" w:name="_Toc231513621"/>
+      <w:bookmarkStart w:id="51" w:name="_Toc232161902"/>
+      <w:bookmarkStart w:id="52" w:name="_Toc232162136"/>
       <w:r>
         <w:rPr>
           <w:rFonts w:ascii="Times New Roman" w:eastAsia="Times New Roman" w:hAnsi="Times New Roman" w:cs="Times New Roman"/>
@@ -6971,10 +6991,10 @@
           </wp:inline>
         </w:drawing>
       </w:r>
-      <w:bookmarkEnd w:id="48"/>
       <w:bookmarkEnd w:id="49"/>
       <w:bookmarkEnd w:id="50"/>
       <w:bookmarkEnd w:id="51"/>
+      <w:bookmarkEnd w:id="52"/>
     </w:p>
     <w:p>
       <w:pPr>
@@ -6983,7 +7003,7 @@
           <w:rFonts w:ascii="Times New Roman" w:hAnsi="Times New Roman" w:cs="Times New Roman"/>
         </w:rPr>
       </w:pPr>
-      <w:bookmarkStart w:id="52" w:name="_Toc231513517"/>
+      <w:bookmarkStart w:id="53" w:name="_Toc231513517"/>
       <w:r>
         <w:rPr>
           <w:rFonts w:ascii="Times New Roman" w:hAnsi="Times New Roman" w:cs="Times New Roman"/>
@@ -7064,7 +7084,7 @@
         </w:rPr>
         <w:t>:Successful login</w:t>
       </w:r>
-      <w:bookmarkEnd w:id="52"/>
+      <w:bookmarkEnd w:id="53"/>
     </w:p>
     <w:p>
       <w:pPr>
@@ -7075,10 +7095,10 @@
           <w:rFonts w:ascii="Times New Roman" w:hAnsi="Times New Roman" w:cs="Times New Roman"/>
         </w:rPr>
       </w:pPr>
-      <w:bookmarkStart w:id="53" w:name="_Toc231513273"/>
-      <w:bookmarkStart w:id="54" w:name="_Toc231513622"/>
-      <w:bookmarkStart w:id="55" w:name="_Toc232161903"/>
-      <w:bookmarkStart w:id="56" w:name="_Toc232162137"/>
+      <w:bookmarkStart w:id="54" w:name="_Toc231513273"/>
+      <w:bookmarkStart w:id="55" w:name="_Toc231513622"/>
+      <w:bookmarkStart w:id="56" w:name="_Toc232161903"/>
+      <w:bookmarkStart w:id="57" w:name="_Toc232162137"/>
       <w:r>
         <w:rPr>
           <w:rFonts w:ascii="Times New Roman" w:eastAsia="Times New Roman" w:hAnsi="Times New Roman" w:cs="Times New Roman"/>
@@ -7181,10 +7201,10 @@
           </wp:inline>
         </w:drawing>
       </w:r>
-      <w:bookmarkEnd w:id="53"/>
       <w:bookmarkEnd w:id="54"/>
       <w:bookmarkEnd w:id="55"/>
       <w:bookmarkEnd w:id="56"/>
+      <w:bookmarkEnd w:id="57"/>
     </w:p>
     <w:p>
       <w:pPr>
@@ -7197,7 +7217,7 @@
           <w:szCs w:val="27"/>
         </w:rPr>
       </w:pPr>
-      <w:bookmarkStart w:id="57" w:name="_Toc231513518"/>
+      <w:bookmarkStart w:id="58" w:name="_Toc231513518"/>
       <w:r>
         <w:rPr>
           <w:rFonts w:ascii="Times New Roman" w:hAnsi="Times New Roman" w:cs="Times New Roman"/>
@@ -7278,7 +7298,7 @@
         </w:rPr>
         <w:t>:Successful Database Connection</w:t>
       </w:r>
-      <w:bookmarkEnd w:id="57"/>
+      <w:bookmarkEnd w:id="58"/>
     </w:p>
     <w:p>
       <w:pPr>
@@ -7289,8 +7309,8 @@
           <w:rFonts w:ascii="Times New Roman" w:hAnsi="Times New Roman" w:cs="Times New Roman"/>
         </w:rPr>
       </w:pPr>
-      <w:bookmarkStart w:id="58" w:name="_Toc232161904"/>
-      <w:bookmarkStart w:id="59" w:name="_Toc232162138"/>
+      <w:bookmarkStart w:id="59" w:name="_Toc232161904"/>
+      <w:bookmarkStart w:id="60" w:name="_Toc232162138"/>
       <w:r>
         <w:rPr>
           <w:rFonts w:ascii="Times New Roman" w:eastAsia="Times New Roman" w:hAnsi="Times New Roman" w:cs="Times New Roman"/>
@@ -7336,8 +7356,8 @@
           </wp:inline>
         </w:drawing>
       </w:r>
-      <w:bookmarkEnd w:id="58"/>
       <w:bookmarkEnd w:id="59"/>
+      <w:bookmarkEnd w:id="60"/>
     </w:p>
     <w:p>
       <w:pPr>
@@ -7350,7 +7370,7 @@
           <w:szCs w:val="27"/>
         </w:rPr>
       </w:pPr>
-      <w:bookmarkStart w:id="60" w:name="_Toc231513519"/>
+      <w:bookmarkStart w:id="61" w:name="_Toc231513519"/>
       <w:r>
         <w:rPr>
           <w:rFonts w:ascii="Times New Roman" w:hAnsi="Times New Roman" w:cs="Times New Roman"/>
@@ -7431,7 +7451,7 @@
         </w:rPr>
         <w:t>: Successful login Into Decorum Bookshop</w:t>
       </w:r>
-      <w:bookmarkEnd w:id="60"/>
+      <w:bookmarkEnd w:id="61"/>
     </w:p>
     <w:p>
       <w:pPr>
@@ -7501,7 +7521,7 @@
           <w:rFonts w:ascii="Times New Roman" w:hAnsi="Times New Roman" w:cs="Times New Roman"/>
         </w:rPr>
       </w:pPr>
-      <w:bookmarkStart w:id="61" w:name="_Toc231513520"/>
+      <w:bookmarkStart w:id="62" w:name="_Toc231513520"/>
       <w:r>
         <w:rPr>
           <w:rFonts w:ascii="Times New Roman" w:hAnsi="Times New Roman" w:cs="Times New Roman"/>
@@ -7594,7 +7614,7 @@
         </w:rPr>
         <w:t>Hidden Sidebar</w:t>
       </w:r>
-      <w:bookmarkEnd w:id="61"/>
+      <w:bookmarkEnd w:id="62"/>
     </w:p>
     <w:p>
       <w:pPr>
@@ -7699,7 +7719,7 @@
           <w:szCs w:val="36"/>
         </w:rPr>
       </w:pPr>
-      <w:bookmarkStart w:id="62" w:name="_Toc232162139"/>
+      <w:bookmarkStart w:id="63" w:name="_Toc232162139"/>
       <w:r>
         <w:rPr>
           <w:rFonts w:ascii="Times New Roman" w:eastAsia="Times New Roman" w:hAnsi="Times New Roman" w:cs="Times New Roman"/>
@@ -7709,7 +7729,7 @@
         </w:rPr>
         <w:t>REFLECTION</w:t>
       </w:r>
-      <w:bookmarkEnd w:id="62"/>
+      <w:bookmarkEnd w:id="63"/>
     </w:p>
     <w:p>
       <w:pPr>
@@ -7887,7 +7907,7 @@
           <w:u w:val="single"/>
         </w:rPr>
       </w:pPr>
-      <w:bookmarkStart w:id="63" w:name="_Toc232162140"/>
+      <w:bookmarkStart w:id="64" w:name="_Toc232162140"/>
       <w:r>
         <w:rPr>
           <w:rFonts w:ascii="Times New Roman" w:eastAsia="Times New Roman" w:hAnsi="Times New Roman" w:cs="Times New Roman"/>
@@ -7911,7 +7931,7 @@
         </w:rPr>
         <w:t xml:space="preserve"> Server-Side Components and Backend Development Foundations</w:t>
       </w:r>
-      <w:bookmarkEnd w:id="63"/>
+      <w:bookmarkEnd w:id="64"/>
     </w:p>
     <w:p>
       <w:pPr>
@@ -8524,8 +8544,8 @@
           <w:rFonts w:ascii="Times New Roman" w:hAnsi="Times New Roman" w:cs="Times New Roman"/>
         </w:rPr>
       </w:pPr>
-      <w:bookmarkStart w:id="64" w:name="_Toc232161907"/>
-      <w:bookmarkStart w:id="65" w:name="_Toc232162141"/>
+      <w:bookmarkStart w:id="65" w:name="_Toc232161907"/>
+      <w:bookmarkStart w:id="66" w:name="_Toc232162141"/>
       <w:r>
         <w:rPr>
           <w:rFonts w:ascii="Times New Roman" w:hAnsi="Times New Roman" w:cs="Times New Roman"/>
@@ -8568,8 +8588,8 @@
           </wp:inline>
         </w:drawing>
       </w:r>
-      <w:bookmarkEnd w:id="64"/>
       <w:bookmarkEnd w:id="65"/>
+      <w:bookmarkEnd w:id="66"/>
     </w:p>
     <w:p>
       <w:pPr>
@@ -8844,8 +8864,8 @@
         <w:lastRenderedPageBreak/>
         <w:br/>
       </w:r>
-      <w:bookmarkStart w:id="66" w:name="_Toc232161908"/>
-      <w:bookmarkStart w:id="67" w:name="_Toc232162142"/>
+      <w:bookmarkStart w:id="67" w:name="_Toc232161908"/>
+      <w:bookmarkStart w:id="68" w:name="_Toc232162142"/>
       <w:r>
         <w:rPr>
           <w:rFonts w:ascii="Times New Roman" w:hAnsi="Times New Roman" w:cs="Times New Roman"/>
@@ -8887,8 +8907,8 @@
           </wp:inline>
         </w:drawing>
       </w:r>
-      <w:bookmarkEnd w:id="66"/>
       <w:bookmarkEnd w:id="67"/>
+      <w:bookmarkEnd w:id="68"/>
     </w:p>
     <w:p>
       <w:pPr>
@@ -9004,7 +9024,7 @@
           <w:u w:val="single"/>
         </w:rPr>
       </w:pPr>
-      <w:bookmarkStart w:id="68" w:name="_Toc232162143"/>
+      <w:bookmarkStart w:id="69" w:name="_Toc232162143"/>
       <w:r>
         <w:rPr>
           <w:rFonts w:ascii="Times New Roman" w:eastAsia="Times New Roman" w:hAnsi="Times New Roman" w:cs="Times New Roman"/>
@@ -9014,7 +9034,7 @@
         </w:rPr>
         <w:t>REFLECTION</w:t>
       </w:r>
-      <w:bookmarkEnd w:id="68"/>
+      <w:bookmarkEnd w:id="69"/>
     </w:p>
     <w:p>
       <w:pPr>
@@ -9030,7 +9050,7 @@
           <w:u w:val="single"/>
         </w:rPr>
       </w:pPr>
-      <w:bookmarkStart w:id="69" w:name="_Toc232162144"/>
+      <w:bookmarkStart w:id="70" w:name="_Toc232162144"/>
       <w:r>
         <w:rPr>
           <w:rFonts w:ascii="Times New Roman" w:eastAsia="Times New Roman" w:hAnsi="Times New Roman" w:cs="Times New Roman"/>
@@ -9052,7 +9072,7 @@
         </w:rPr>
         <w:t>ing the platform more secure with less effort . I’ve learnt that it is Database agnostic , yet to prove but may test the feature in the future. Worked with a try-catch block in db_connect.php to connect to the database. It is well suited to handle exceptions that If…Else statement.</w:t>
       </w:r>
-      <w:bookmarkEnd w:id="69"/>
+      <w:bookmarkEnd w:id="70"/>
       <w:r>
         <w:rPr>
           <w:rFonts w:ascii="Times New Roman" w:eastAsia="Times New Roman" w:hAnsi="Times New Roman" w:cs="Times New Roman"/>
@@ -9118,7 +9138,7 @@
           <w:u w:val="single"/>
         </w:rPr>
       </w:pPr>
-      <w:bookmarkStart w:id="70" w:name="_Toc232162145"/>
+      <w:bookmarkStart w:id="71" w:name="_Toc232162145"/>
       <w:r>
         <w:rPr>
           <w:rFonts w:ascii="Times New Roman" w:eastAsia="Times New Roman" w:hAnsi="Times New Roman" w:cs="Times New Roman"/>
@@ -9131,7 +9151,7 @@
         <w:lastRenderedPageBreak/>
         <w:t>WEEK 5</w:t>
       </w:r>
-      <w:bookmarkEnd w:id="70"/>
+      <w:bookmarkEnd w:id="71"/>
       <w:r>
         <w:rPr>
           <w:rFonts w:ascii="Times New Roman" w:eastAsia="Times New Roman" w:hAnsi="Times New Roman" w:cs="Times New Roman"/>
@@ -9158,7 +9178,7 @@
           <w:u w:val="single"/>
         </w:rPr>
       </w:pPr>
-      <w:bookmarkStart w:id="71" w:name="_Toc232162146"/>
+      <w:bookmarkStart w:id="72" w:name="_Toc232162146"/>
       <w:r>
         <w:rPr>
           <w:rStyle w:val="Heading2Char"/>
@@ -9207,7 +9227,7 @@
         </w:rPr>
         <w:t>perations</w:t>
       </w:r>
-      <w:bookmarkEnd w:id="71"/>
+      <w:bookmarkEnd w:id="72"/>
     </w:p>
     <w:p>
       <w:pPr>
@@ -9218,7 +9238,7 @@
           <w:rFonts w:ascii="Times New Roman" w:hAnsi="Times New Roman" w:cs="Times New Roman"/>
         </w:rPr>
       </w:pPr>
-      <w:bookmarkStart w:id="72" w:name="_Toc232162147"/>
+      <w:bookmarkStart w:id="73" w:name="_Toc232162147"/>
       <w:r>
         <w:rPr>
           <w:rFonts w:ascii="Times New Roman" w:eastAsia="Times New Roman" w:hAnsi="Times New Roman" w:cs="Times New Roman"/>
@@ -9260,19 +9280,13 @@
           </wp:inline>
         </w:drawing>
       </w:r>
-      <w:bookmarkEnd w:id="72"/>
+      <w:bookmarkEnd w:id="73"/>
     </w:p>
     <w:p>
       <w:pPr>
         <w:pStyle w:val="Caption"/>
         <w:rPr>
-          <w:rStyle w:val="Heading2Char"/>
-          <w:rFonts w:ascii="Times New Roman" w:hAnsi="Times New Roman" w:cs="Times New Roman"/>
-          <w:b/>
-          <w:color w:val="000000" w:themeColor="text1"/>
-          <w:sz w:val="36"/>
-          <w:szCs w:val="36"/>
-          <w:u w:val="single"/>
+          <w:rFonts w:ascii="Times New Roman" w:hAnsi="Times New Roman" w:cs="Times New Roman"/>
         </w:rPr>
       </w:pPr>
       <w:r>
@@ -9356,35 +9370,17 @@
         <w:t>:GitHub repository</w:t>
       </w:r>
     </w:p>
-    <w:p>
-      <w:pPr>
-        <w:pStyle w:val="Caption"/>
+    <w:p/>
+    <w:p>
+      <w:pPr>
         <w:keepNext/>
-        <w:rPr>
-          <w:rFonts w:ascii="Times New Roman" w:hAnsi="Times New Roman" w:cs="Times New Roman"/>
-        </w:rPr>
-      </w:pPr>
-      <w:r>
-        <w:rPr>
-          <w:rFonts w:ascii="Times New Roman" w:hAnsi="Times New Roman" w:cs="Times New Roman"/>
-        </w:rPr>
-        <w:br/>
-      </w:r>
-      <w:r>
-        <w:rPr>
-          <w:rFonts w:ascii="Times New Roman" w:eastAsia="Times New Roman" w:hAnsi="Times New Roman" w:cs="Times New Roman"/>
-          <w:b/>
-          <w:bCs/>
-          <w:noProof/>
-          <w:sz w:val="27"/>
-          <w:szCs w:val="27"/>
-          <w:u w:val="single"/>
-        </w:rPr>
+      </w:pPr>
+      <w:r>
         <w:drawing>
-          <wp:inline distT="0" distB="0" distL="0" distR="0" wp14:anchorId="68B89567" wp14:editId="7239E71C">
-            <wp:extent cx="5941268" cy="2853732"/>
-            <wp:effectExtent l="0" t="0" r="2540" b="3810"/>
-            <wp:docPr id="30" name="Picture 30"/>
+          <wp:inline distT="0" distB="0" distL="0" distR="0" wp14:anchorId="60AD650B" wp14:editId="5BA21D75">
+            <wp:extent cx="5941823" cy="2562330"/>
+            <wp:effectExtent l="0" t="0" r="1905" b="9525"/>
+            <wp:docPr id="52" name="Picture 52"/>
             <wp:cNvGraphicFramePr>
               <a:graphicFrameLocks xmlns:a="http://schemas.openxmlformats.org/drawingml/2006/main" noChangeAspect="1"/>
             </wp:cNvGraphicFramePr>
@@ -9404,7 +9400,7 @@
                   <pic:spPr>
                     <a:xfrm>
                       <a:off x="0" y="0"/>
-                      <a:ext cx="5956957" cy="2861268"/>
+                      <a:ext cx="5958272" cy="2569423"/>
                     </a:xfrm>
                     <a:prstGeom prst="rect">
                       <a:avLst/>
@@ -9421,120 +9417,72 @@
       <w:pPr>
         <w:pStyle w:val="Caption"/>
         <w:rPr>
-          <w:rFonts w:ascii="Times New Roman" w:eastAsia="Times New Roman" w:hAnsi="Times New Roman" w:cs="Times New Roman"/>
-          <w:b/>
-          <w:bCs/>
-          <w:sz w:val="27"/>
-          <w:szCs w:val="27"/>
-          <w:u w:val="single"/>
-        </w:rPr>
-      </w:pPr>
-      <w:r>
-        <w:rPr>
-          <w:rFonts w:ascii="Times New Roman" w:hAnsi="Times New Roman" w:cs="Times New Roman"/>
-        </w:rPr>
+          <w:noProof/>
+        </w:rPr>
+      </w:pPr>
+      <w:r>
         <w:t xml:space="preserve">Figure </w:t>
       </w:r>
       <w:r>
-        <w:rPr>
-          <w:rFonts w:ascii="Times New Roman" w:hAnsi="Times New Roman" w:cs="Times New Roman"/>
-        </w:rPr>
         <w:fldChar w:fldCharType="begin"/>
       </w:r>
       <w:r>
-        <w:rPr>
-          <w:rFonts w:ascii="Times New Roman" w:hAnsi="Times New Roman" w:cs="Times New Roman"/>
-        </w:rPr>
         <w:instrText xml:space="preserve"> STYLEREF 1 \s </w:instrText>
       </w:r>
       <w:r>
-        <w:rPr>
-          <w:rFonts w:ascii="Times New Roman" w:hAnsi="Times New Roman" w:cs="Times New Roman"/>
-        </w:rPr>
         <w:fldChar w:fldCharType="separate"/>
       </w:r>
       <w:r>
         <w:rPr>
-          <w:rFonts w:ascii="Times New Roman" w:hAnsi="Times New Roman" w:cs="Times New Roman"/>
           <w:noProof/>
         </w:rPr>
         <w:t>0</w:t>
       </w:r>
       <w:r>
-        <w:rPr>
-          <w:rFonts w:ascii="Times New Roman" w:hAnsi="Times New Roman" w:cs="Times New Roman"/>
-        </w:rPr>
         <w:fldChar w:fldCharType="end"/>
       </w:r>
       <w:r>
-        <w:rPr>
-          <w:rFonts w:ascii="Times New Roman" w:hAnsi="Times New Roman" w:cs="Times New Roman"/>
-        </w:rPr>
         <w:noBreakHyphen/>
       </w:r>
       <w:r>
-        <w:rPr>
-          <w:rFonts w:ascii="Times New Roman" w:hAnsi="Times New Roman" w:cs="Times New Roman"/>
-        </w:rPr>
         <w:fldChar w:fldCharType="begin"/>
       </w:r>
       <w:r>
-        <w:rPr>
-          <w:rFonts w:ascii="Times New Roman" w:hAnsi="Times New Roman" w:cs="Times New Roman"/>
-        </w:rPr>
         <w:instrText xml:space="preserve"> SEQ Figure \* ARABIC \s 1 </w:instrText>
       </w:r>
       <w:r>
-        <w:rPr>
-          <w:rFonts w:ascii="Times New Roman" w:hAnsi="Times New Roman" w:cs="Times New Roman"/>
-        </w:rPr>
         <w:fldChar w:fldCharType="separate"/>
       </w:r>
       <w:r>
         <w:rPr>
-          <w:rFonts w:ascii="Times New Roman" w:hAnsi="Times New Roman" w:cs="Times New Roman"/>
           <w:noProof/>
         </w:rPr>
         <w:t>2</w:t>
       </w:r>
       <w:r>
-        <w:rPr>
-          <w:rFonts w:ascii="Times New Roman" w:hAnsi="Times New Roman" w:cs="Times New Roman"/>
-        </w:rPr>
         <w:fldChar w:fldCharType="end"/>
       </w:r>
       <w:r>
-        <w:rPr>
-          <w:rFonts w:ascii="Times New Roman" w:hAnsi="Times New Roman" w:cs="Times New Roman"/>
-        </w:rPr>
-        <w:t>: decorum_bookshop databse structure</w:t>
-      </w:r>
-    </w:p>
-    <w:p>
-      <w:pPr>
-        <w:pStyle w:val="Caption"/>
+        <w:t>:SQL Script CREATE Books Table and Insert</w:t>
+      </w:r>
+      <w:r>
+        <w:rPr>
+          <w:noProof/>
+        </w:rPr>
+        <w:t xml:space="preserve"> sample book records</w:t>
+      </w:r>
+    </w:p>
+    <w:p>
+      <w:pPr>
         <w:keepNext/>
-        <w:rPr>
-          <w:rFonts w:ascii="Times New Roman" w:hAnsi="Times New Roman" w:cs="Times New Roman"/>
-        </w:rPr>
-      </w:pPr>
-      <w:r>
-        <w:rPr>
-          <w:rFonts w:ascii="Times New Roman" w:hAnsi="Times New Roman" w:cs="Times New Roman"/>
-        </w:rPr>
+      </w:pPr>
+      <w:r>
         <w:lastRenderedPageBreak/>
-        <w:t xml:space="preserve"> </w:t>
-      </w:r>
-      <w:r>
-        <w:rPr>
-          <w:rFonts w:ascii="Times New Roman" w:hAnsi="Times New Roman" w:cs="Times New Roman"/>
-          <w:noProof/>
-        </w:rPr>
         <w:drawing>
-          <wp:inline distT="0" distB="0" distL="0" distR="0" wp14:anchorId="70ACF670" wp14:editId="0599864A">
-            <wp:extent cx="5943600" cy="3195376"/>
-            <wp:effectExtent l="0" t="0" r="0" b="5080"/>
-            <wp:docPr id="28" name="Picture 28"/>
+          <wp:inline distT="0" distB="0" distL="0" distR="0" wp14:anchorId="3EF98ED0" wp14:editId="0F4CA759">
+            <wp:extent cx="5943600" cy="2532185"/>
+            <wp:effectExtent l="0" t="0" r="0" b="1905"/>
+            <wp:docPr id="53" name="Picture 53"/>
             <wp:cNvGraphicFramePr>
               <a:graphicFrameLocks xmlns:a="http://schemas.openxmlformats.org/drawingml/2006/main" noChangeAspect="1"/>
             </wp:cNvGraphicFramePr>
@@ -9554,7 +9502,7 @@
                   <pic:spPr>
                     <a:xfrm>
                       <a:off x="0" y="0"/>
-                      <a:ext cx="5948051" cy="3197769"/>
+                      <a:ext cx="5948103" cy="2534103"/>
                     </a:xfrm>
                     <a:prstGeom prst="rect">
                       <a:avLst/>
@@ -9570,91 +9518,54 @@
     <w:p>
       <w:pPr>
         <w:pStyle w:val="Caption"/>
-        <w:rPr>
-          <w:rFonts w:ascii="Times New Roman" w:hAnsi="Times New Roman" w:cs="Times New Roman"/>
-        </w:rPr>
-      </w:pPr>
-      <w:r>
-        <w:rPr>
-          <w:rFonts w:ascii="Times New Roman" w:hAnsi="Times New Roman" w:cs="Times New Roman"/>
-        </w:rPr>
+      </w:pPr>
+      <w:r>
         <w:t xml:space="preserve">Figure </w:t>
       </w:r>
       <w:r>
-        <w:rPr>
-          <w:rFonts w:ascii="Times New Roman" w:hAnsi="Times New Roman" w:cs="Times New Roman"/>
-        </w:rPr>
         <w:fldChar w:fldCharType="begin"/>
       </w:r>
       <w:r>
-        <w:rPr>
-          <w:rFonts w:ascii="Times New Roman" w:hAnsi="Times New Roman" w:cs="Times New Roman"/>
-        </w:rPr>
         <w:instrText xml:space="preserve"> STYLEREF 1 \s </w:instrText>
       </w:r>
       <w:r>
-        <w:rPr>
-          <w:rFonts w:ascii="Times New Roman" w:hAnsi="Times New Roman" w:cs="Times New Roman"/>
-        </w:rPr>
         <w:fldChar w:fldCharType="separate"/>
       </w:r>
       <w:r>
         <w:rPr>
-          <w:rFonts w:ascii="Times New Roman" w:hAnsi="Times New Roman" w:cs="Times New Roman"/>
           <w:noProof/>
         </w:rPr>
         <w:t>0</w:t>
       </w:r>
       <w:r>
-        <w:rPr>
-          <w:rFonts w:ascii="Times New Roman" w:hAnsi="Times New Roman" w:cs="Times New Roman"/>
-        </w:rPr>
         <w:fldChar w:fldCharType="end"/>
       </w:r>
       <w:r>
-        <w:rPr>
-          <w:rFonts w:ascii="Times New Roman" w:hAnsi="Times New Roman" w:cs="Times New Roman"/>
-        </w:rPr>
         <w:noBreakHyphen/>
       </w:r>
       <w:r>
-        <w:rPr>
-          <w:rFonts w:ascii="Times New Roman" w:hAnsi="Times New Roman" w:cs="Times New Roman"/>
-        </w:rPr>
         <w:fldChar w:fldCharType="begin"/>
       </w:r>
       <w:r>
-        <w:rPr>
-          <w:rFonts w:ascii="Times New Roman" w:hAnsi="Times New Roman" w:cs="Times New Roman"/>
-        </w:rPr>
         <w:instrText xml:space="preserve"> SEQ Figure \* ARABIC \s 1 </w:instrText>
       </w:r>
       <w:r>
-        <w:rPr>
-          <w:rFonts w:ascii="Times New Roman" w:hAnsi="Times New Roman" w:cs="Times New Roman"/>
-        </w:rPr>
         <w:fldChar w:fldCharType="separate"/>
       </w:r>
       <w:r>
         <w:rPr>
-          <w:rFonts w:ascii="Times New Roman" w:hAnsi="Times New Roman" w:cs="Times New Roman"/>
           <w:noProof/>
         </w:rPr>
         <w:t>3</w:t>
       </w:r>
       <w:r>
-        <w:rPr>
-          <w:rFonts w:ascii="Times New Roman" w:hAnsi="Times New Roman" w:cs="Times New Roman"/>
-        </w:rPr>
         <w:fldChar w:fldCharType="end"/>
       </w:r>
       <w:r>
-        <w:rPr>
-          <w:rFonts w:ascii="Times New Roman" w:hAnsi="Times New Roman" w:cs="Times New Roman"/>
-        </w:rPr>
-        <w:t>: AddNew Book Form</w:t>
-      </w:r>
-    </w:p>
+        <w:t>: Books Table with Sample book records</w:t>
+      </w:r>
+    </w:p>
+    <w:p/>
     <w:p>
       <w:pPr>
         <w:pStyle w:val="Caption"/>
@@ -9666,13 +9577,24 @@
       <w:r>
         <w:rPr>
           <w:rFonts w:ascii="Times New Roman" w:hAnsi="Times New Roman" w:cs="Times New Roman"/>
-          <w:noProof/>
+        </w:rPr>
+        <w:br/>
+      </w:r>
+      <w:r>
+        <w:rPr>
+          <w:rFonts w:ascii="Times New Roman" w:eastAsia="Times New Roman" w:hAnsi="Times New Roman" w:cs="Times New Roman"/>
+          <w:b/>
+          <w:bCs/>
+          <w:noProof/>
+          <w:sz w:val="27"/>
+          <w:szCs w:val="27"/>
+          <w:u w:val="single"/>
         </w:rPr>
         <w:drawing>
-          <wp:inline distT="0" distB="0" distL="0" distR="0" wp14:anchorId="7B1B4762" wp14:editId="608E83CC">
-            <wp:extent cx="5943600" cy="914400"/>
-            <wp:effectExtent l="0" t="0" r="0" b="0"/>
-            <wp:docPr id="29" name="Picture 29"/>
+          <wp:inline distT="0" distB="0" distL="0" distR="0" wp14:anchorId="68B89567" wp14:editId="7239E71C">
+            <wp:extent cx="5941060" cy="3195376"/>
+            <wp:effectExtent l="0" t="0" r="2540" b="5080"/>
+            <wp:docPr id="30" name="Picture 30"/>
             <wp:cNvGraphicFramePr>
               <a:graphicFrameLocks xmlns:a="http://schemas.openxmlformats.org/drawingml/2006/main" noChangeAspect="1"/>
             </wp:cNvGraphicFramePr>
@@ -9692,7 +9614,7 @@
                   <pic:spPr>
                     <a:xfrm>
                       <a:off x="0" y="0"/>
-                      <a:ext cx="5943600" cy="914400"/>
+                      <a:ext cx="5964900" cy="3208198"/>
                     </a:xfrm>
                     <a:prstGeom prst="rect">
                       <a:avLst/>
@@ -9709,7 +9631,12 @@
       <w:pPr>
         <w:pStyle w:val="Caption"/>
         <w:rPr>
-          <w:rFonts w:ascii="Times New Roman" w:hAnsi="Times New Roman" w:cs="Times New Roman"/>
+          <w:rFonts w:ascii="Times New Roman" w:eastAsia="Times New Roman" w:hAnsi="Times New Roman" w:cs="Times New Roman"/>
+          <w:b/>
+          <w:bCs/>
+          <w:sz w:val="27"/>
+          <w:szCs w:val="27"/>
+          <w:u w:val="single"/>
         </w:rPr>
       </w:pPr>
       <w:r>
@@ -9790,30 +9717,50 @@
         <w:rPr>
           <w:rFonts w:ascii="Times New Roman" w:hAnsi="Times New Roman" w:cs="Times New Roman"/>
         </w:rPr>
-        <w:t>: New Book Added to the Catalog</w:t>
-      </w:r>
-      <w:r>
-        <w:rPr>
-          <w:rFonts w:ascii="Times New Roman" w:hAnsi="Times New Roman" w:cs="Times New Roman"/>
-        </w:rPr>
-        <w:br/>
-      </w:r>
-      <w:r>
-        <w:rPr>
-          <w:rFonts w:ascii="Times New Roman" w:hAnsi="Times New Roman" w:cs="Times New Roman"/>
-        </w:rPr>
-        <w:br/>
-      </w:r>
-      <w:r>
-        <w:rPr>
-          <w:rFonts w:ascii="Times New Roman" w:hAnsi="Times New Roman" w:cs="Times New Roman"/>
-          <w:noProof/>
-        </w:rPr>
+        <w:t>: decorum_bookshop databse structure</w:t>
+      </w:r>
+    </w:p>
+    <w:p>
+      <w:pPr>
+        <w:pStyle w:val="Caption"/>
+        <w:keepNext/>
+        <w:rPr>
+          <w:rFonts w:ascii="Times New Roman" w:hAnsi="Times New Roman" w:cs="Times New Roman"/>
+        </w:rPr>
+      </w:pPr>
+      <w:r>
+        <w:rPr>
+          <w:rFonts w:ascii="Times New Roman" w:hAnsi="Times New Roman" w:cs="Times New Roman"/>
+        </w:rPr>
+        <w:t xml:space="preserve"> </w:t>
+      </w:r>
+    </w:p>
+    <w:p>
+      <w:pPr>
+        <w:pStyle w:val="Caption"/>
+        <w:rPr>
+          <w:rFonts w:ascii="Times New Roman" w:hAnsi="Times New Roman" w:cs="Times New Roman"/>
+        </w:rPr>
+      </w:pPr>
+    </w:p>
+    <w:p>
+      <w:pPr>
+        <w:keepNext/>
+        <w:rPr>
+          <w:rFonts w:ascii="Times New Roman" w:hAnsi="Times New Roman" w:cs="Times New Roman"/>
+        </w:rPr>
+      </w:pPr>
+      <w:r>
+        <w:rPr>
+          <w:rFonts w:ascii="Times New Roman" w:hAnsi="Times New Roman" w:cs="Times New Roman"/>
+          <w:noProof/>
+        </w:rPr>
+        <w:lastRenderedPageBreak/>
         <w:drawing>
-          <wp:inline distT="0" distB="0" distL="0" distR="0" wp14:anchorId="638486BD" wp14:editId="592E1D43">
-            <wp:extent cx="5943600" cy="2703007"/>
-            <wp:effectExtent l="0" t="0" r="0" b="2540"/>
-            <wp:docPr id="32" name="Picture 32"/>
+          <wp:inline distT="0" distB="0" distL="0" distR="0" wp14:anchorId="7B3E0EF4" wp14:editId="1625F56A">
+            <wp:extent cx="5943513" cy="3431263"/>
+            <wp:effectExtent l="0" t="0" r="635" b="0"/>
+            <wp:docPr id="34" name="Picture 34"/>
             <wp:cNvGraphicFramePr>
               <a:graphicFrameLocks xmlns:a="http://schemas.openxmlformats.org/drawingml/2006/main" noChangeAspect="1"/>
             </wp:cNvGraphicFramePr>
@@ -9833,7 +9780,7 @@
                   <pic:spPr>
                     <a:xfrm>
                       <a:off x="0" y="0"/>
-                      <a:ext cx="5945203" cy="2703736"/>
+                      <a:ext cx="5955050" cy="3437924"/>
                     </a:xfrm>
                     <a:prstGeom prst="rect">
                       <a:avLst/>
@@ -9931,7 +9878,7 @@
         <w:rPr>
           <w:rFonts w:ascii="Times New Roman" w:hAnsi="Times New Roman" w:cs="Times New Roman"/>
         </w:rPr>
-        <w:t>: Delete A book From Database</w:t>
+        <w:t>: Week 5 File structure</w:t>
       </w:r>
     </w:p>
     <w:p>
@@ -9946,12 +9893,11 @@
           <w:rFonts w:ascii="Times New Roman" w:hAnsi="Times New Roman" w:cs="Times New Roman"/>
           <w:noProof/>
         </w:rPr>
-        <w:lastRenderedPageBreak/>
         <w:drawing>
-          <wp:inline distT="0" distB="0" distL="0" distR="0" wp14:anchorId="63ACD698" wp14:editId="678F8FBD">
-            <wp:extent cx="5943600" cy="1383030"/>
-            <wp:effectExtent l="0" t="0" r="0" b="7620"/>
-            <wp:docPr id="33" name="Picture 33"/>
+          <wp:inline distT="0" distB="0" distL="0" distR="0" wp14:anchorId="468471B7" wp14:editId="36A830D8">
+            <wp:extent cx="5940246" cy="2308634"/>
+            <wp:effectExtent l="0" t="0" r="3810" b="0"/>
+            <wp:docPr id="35" name="Picture 35"/>
             <wp:cNvGraphicFramePr>
               <a:graphicFrameLocks xmlns:a="http://schemas.openxmlformats.org/drawingml/2006/main" noChangeAspect="1"/>
             </wp:cNvGraphicFramePr>
@@ -9971,7 +9917,7 @@
                   <pic:spPr>
                     <a:xfrm>
                       <a:off x="0" y="0"/>
-                      <a:ext cx="5943600" cy="1383030"/>
+                      <a:ext cx="5962728" cy="2317372"/>
                     </a:xfrm>
                     <a:prstGeom prst="rect">
                       <a:avLst/>
@@ -10069,38 +10015,26 @@
         <w:rPr>
           <w:rFonts w:ascii="Times New Roman" w:hAnsi="Times New Roman" w:cs="Times New Roman"/>
         </w:rPr>
-        <w:t>: Deleted Record: Mamamia Book</w:t>
-      </w:r>
-      <w:r>
-        <w:rPr>
-          <w:rFonts w:ascii="Times New Roman" w:hAnsi="Times New Roman" w:cs="Times New Roman"/>
-        </w:rPr>
-        <w:br/>
-      </w:r>
-      <w:r>
-        <w:rPr>
-          <w:rFonts w:ascii="Times New Roman" w:hAnsi="Times New Roman" w:cs="Times New Roman"/>
-        </w:rPr>
-        <w:br/>
-      </w:r>
-    </w:p>
+        <w:t>:PDO Queries to fetch Order Mnagement Informtion from Database</w:t>
+      </w:r>
+      <w:r>
+        <w:rPr>
+          <w:rFonts w:ascii="Times New Roman" w:hAnsi="Times New Roman" w:cs="Times New Roman"/>
+        </w:rPr>
+        <w:t xml:space="preserve"> for the Top Cards</w:t>
+      </w:r>
+    </w:p>
+    <w:p/>
     <w:p>
       <w:pPr>
         <w:keepNext/>
-        <w:rPr>
-          <w:rFonts w:ascii="Times New Roman" w:hAnsi="Times New Roman" w:cs="Times New Roman"/>
-        </w:rPr>
-      </w:pPr>
-      <w:r>
-        <w:rPr>
-          <w:rFonts w:ascii="Times New Roman" w:hAnsi="Times New Roman" w:cs="Times New Roman"/>
-          <w:noProof/>
-        </w:rPr>
+      </w:pPr>
+      <w:r>
         <w:drawing>
-          <wp:inline distT="0" distB="0" distL="0" distR="0" wp14:anchorId="7B3E0EF4" wp14:editId="1625F56A">
-            <wp:extent cx="5943600" cy="3410585"/>
+          <wp:inline distT="0" distB="0" distL="0" distR="0" wp14:anchorId="0DE37E2C" wp14:editId="43A37905">
+            <wp:extent cx="5943600" cy="914400"/>
             <wp:effectExtent l="0" t="0" r="0" b="0"/>
-            <wp:docPr id="34" name="Picture 34"/>
+            <wp:docPr id="55" name="Picture 55"/>
             <wp:cNvGraphicFramePr>
               <a:graphicFrameLocks xmlns:a="http://schemas.openxmlformats.org/drawingml/2006/main" noChangeAspect="1"/>
             </wp:cNvGraphicFramePr>
@@ -10120,7 +10054,7 @@
                   <pic:spPr>
                     <a:xfrm>
                       <a:off x="0" y="0"/>
-                      <a:ext cx="5943600" cy="3410585"/>
+                      <a:ext cx="5943600" cy="914400"/>
                     </a:xfrm>
                     <a:prstGeom prst="rect">
                       <a:avLst/>
@@ -10136,108 +10070,64 @@
     <w:p>
       <w:pPr>
         <w:pStyle w:val="Caption"/>
-        <w:rPr>
-          <w:rFonts w:ascii="Times New Roman" w:hAnsi="Times New Roman" w:cs="Times New Roman"/>
-        </w:rPr>
-      </w:pPr>
-      <w:r>
-        <w:rPr>
-          <w:rFonts w:ascii="Times New Roman" w:hAnsi="Times New Roman" w:cs="Times New Roman"/>
-        </w:rPr>
+      </w:pPr>
+      <w:r>
         <w:t xml:space="preserve">Figure </w:t>
       </w:r>
       <w:r>
-        <w:rPr>
-          <w:rFonts w:ascii="Times New Roman" w:hAnsi="Times New Roman" w:cs="Times New Roman"/>
-        </w:rPr>
         <w:fldChar w:fldCharType="begin"/>
       </w:r>
       <w:r>
-        <w:rPr>
-          <w:rFonts w:ascii="Times New Roman" w:hAnsi="Times New Roman" w:cs="Times New Roman"/>
-        </w:rPr>
         <w:instrText xml:space="preserve"> STYLEREF 1 \s </w:instrText>
       </w:r>
       <w:r>
-        <w:rPr>
-          <w:rFonts w:ascii="Times New Roman" w:hAnsi="Times New Roman" w:cs="Times New Roman"/>
-        </w:rPr>
         <w:fldChar w:fldCharType="separate"/>
       </w:r>
       <w:r>
         <w:rPr>
-          <w:rFonts w:ascii="Times New Roman" w:hAnsi="Times New Roman" w:cs="Times New Roman"/>
           <w:noProof/>
         </w:rPr>
         <w:t>0</w:t>
       </w:r>
       <w:r>
-        <w:rPr>
-          <w:rFonts w:ascii="Times New Roman" w:hAnsi="Times New Roman" w:cs="Times New Roman"/>
-        </w:rPr>
         <w:fldChar w:fldCharType="end"/>
       </w:r>
       <w:r>
-        <w:rPr>
-          <w:rFonts w:ascii="Times New Roman" w:hAnsi="Times New Roman" w:cs="Times New Roman"/>
-        </w:rPr>
         <w:noBreakHyphen/>
       </w:r>
       <w:r>
-        <w:rPr>
-          <w:rFonts w:ascii="Times New Roman" w:hAnsi="Times New Roman" w:cs="Times New Roman"/>
-        </w:rPr>
         <w:fldChar w:fldCharType="begin"/>
       </w:r>
       <w:r>
-        <w:rPr>
-          <w:rFonts w:ascii="Times New Roman" w:hAnsi="Times New Roman" w:cs="Times New Roman"/>
-        </w:rPr>
         <w:instrText xml:space="preserve"> SEQ Figure \* ARABIC \s 1 </w:instrText>
       </w:r>
       <w:r>
-        <w:rPr>
-          <w:rFonts w:ascii="Times New Roman" w:hAnsi="Times New Roman" w:cs="Times New Roman"/>
-        </w:rPr>
         <w:fldChar w:fldCharType="separate"/>
       </w:r>
       <w:r>
         <w:rPr>
-          <w:rFonts w:ascii="Times New Roman" w:hAnsi="Times New Roman" w:cs="Times New Roman"/>
           <w:noProof/>
         </w:rPr>
         <w:t>7</w:t>
       </w:r>
       <w:r>
-        <w:rPr>
-          <w:rFonts w:ascii="Times New Roman" w:hAnsi="Times New Roman" w:cs="Times New Roman"/>
-        </w:rPr>
         <w:fldChar w:fldCharType="end"/>
       </w:r>
       <w:r>
-        <w:rPr>
-          <w:rFonts w:ascii="Times New Roman" w:hAnsi="Times New Roman" w:cs="Times New Roman"/>
-        </w:rPr>
-        <w:t>: Week 5 File structure</w:t>
+        <w:t>; Top Cards</w:t>
       </w:r>
     </w:p>
     <w:p>
       <w:pPr>
         <w:keepNext/>
-        <w:rPr>
-          <w:rFonts w:ascii="Times New Roman" w:hAnsi="Times New Roman" w:cs="Times New Roman"/>
-        </w:rPr>
-      </w:pPr>
-      <w:r>
-        <w:rPr>
-          <w:rFonts w:ascii="Times New Roman" w:hAnsi="Times New Roman" w:cs="Times New Roman"/>
-          <w:noProof/>
-        </w:rPr>
+      </w:pPr>
+      <w:r>
+        <w:lastRenderedPageBreak/>
         <w:drawing>
-          <wp:inline distT="0" distB="0" distL="0" distR="0" wp14:anchorId="468471B7" wp14:editId="36A830D8">
-            <wp:extent cx="5943600" cy="1919235"/>
-            <wp:effectExtent l="0" t="0" r="0" b="5080"/>
-            <wp:docPr id="35" name="Picture 35"/>
+          <wp:inline distT="0" distB="0" distL="0" distR="0" wp14:anchorId="046C4AA7" wp14:editId="658AE831">
+            <wp:extent cx="5942965" cy="3051018"/>
+            <wp:effectExtent l="0" t="0" r="635" b="0"/>
+            <wp:docPr id="54" name="Picture 54"/>
             <wp:cNvGraphicFramePr>
               <a:graphicFrameLocks xmlns:a="http://schemas.openxmlformats.org/drawingml/2006/main" noChangeAspect="1"/>
             </wp:cNvGraphicFramePr>
@@ -10257,7 +10147,7 @@
                   <pic:spPr>
                     <a:xfrm>
                       <a:off x="0" y="0"/>
-                      <a:ext cx="5949519" cy="1921146"/>
+                      <a:ext cx="5960516" cy="3060028"/>
                     </a:xfrm>
                     <a:prstGeom prst="rect">
                       <a:avLst/>
@@ -10273,100 +10163,54 @@
     <w:p>
       <w:pPr>
         <w:pStyle w:val="Caption"/>
-        <w:rPr>
-          <w:rFonts w:ascii="Times New Roman" w:hAnsi="Times New Roman" w:cs="Times New Roman"/>
-        </w:rPr>
-      </w:pPr>
-      <w:r>
-        <w:rPr>
-          <w:rFonts w:ascii="Times New Roman" w:hAnsi="Times New Roman" w:cs="Times New Roman"/>
-        </w:rPr>
+      </w:pPr>
+      <w:r>
         <w:t xml:space="preserve">Figure </w:t>
       </w:r>
       <w:r>
-        <w:rPr>
-          <w:rFonts w:ascii="Times New Roman" w:hAnsi="Times New Roman" w:cs="Times New Roman"/>
-        </w:rPr>
         <w:fldChar w:fldCharType="begin"/>
       </w:r>
       <w:r>
-        <w:rPr>
-          <w:rFonts w:ascii="Times New Roman" w:hAnsi="Times New Roman" w:cs="Times New Roman"/>
-        </w:rPr>
         <w:instrText xml:space="preserve"> STYLEREF 1 \s </w:instrText>
       </w:r>
       <w:r>
-        <w:rPr>
-          <w:rFonts w:ascii="Times New Roman" w:hAnsi="Times New Roman" w:cs="Times New Roman"/>
-        </w:rPr>
         <w:fldChar w:fldCharType="separate"/>
       </w:r>
       <w:r>
         <w:rPr>
-          <w:rFonts w:ascii="Times New Roman" w:hAnsi="Times New Roman" w:cs="Times New Roman"/>
           <w:noProof/>
         </w:rPr>
         <w:t>0</w:t>
       </w:r>
       <w:r>
-        <w:rPr>
-          <w:rFonts w:ascii="Times New Roman" w:hAnsi="Times New Roman" w:cs="Times New Roman"/>
-        </w:rPr>
         <w:fldChar w:fldCharType="end"/>
       </w:r>
       <w:r>
-        <w:rPr>
-          <w:rFonts w:ascii="Times New Roman" w:hAnsi="Times New Roman" w:cs="Times New Roman"/>
-        </w:rPr>
         <w:noBreakHyphen/>
       </w:r>
       <w:r>
-        <w:rPr>
-          <w:rFonts w:ascii="Times New Roman" w:hAnsi="Times New Roman" w:cs="Times New Roman"/>
-        </w:rPr>
         <w:fldChar w:fldCharType="begin"/>
       </w:r>
       <w:r>
-        <w:rPr>
-          <w:rFonts w:ascii="Times New Roman" w:hAnsi="Times New Roman" w:cs="Times New Roman"/>
-        </w:rPr>
         <w:instrText xml:space="preserve"> SEQ Figure \* ARABIC \s 1 </w:instrText>
       </w:r>
       <w:r>
-        <w:rPr>
-          <w:rFonts w:ascii="Times New Roman" w:hAnsi="Times New Roman" w:cs="Times New Roman"/>
-        </w:rPr>
         <w:fldChar w:fldCharType="separate"/>
       </w:r>
       <w:r>
         <w:rPr>
-          <w:rFonts w:ascii="Times New Roman" w:hAnsi="Times New Roman" w:cs="Times New Roman"/>
           <w:noProof/>
         </w:rPr>
         <w:t>8</w:t>
       </w:r>
       <w:r>
-        <w:rPr>
-          <w:rFonts w:ascii="Times New Roman" w:hAnsi="Times New Roman" w:cs="Times New Roman"/>
-        </w:rPr>
         <w:fldChar w:fldCharType="end"/>
       </w:r>
       <w:r>
-        <w:rPr>
-          <w:rFonts w:ascii="Times New Roman" w:hAnsi="Times New Roman" w:cs="Times New Roman"/>
-        </w:rPr>
-        <w:t>:PDO Queries to fetch Order Mnagement Informtion from Database</w:t>
-      </w:r>
-    </w:p>
-    <w:p>
-      <w:pPr>
-        <w:rPr>
-          <w:rFonts w:ascii="Times New Roman" w:hAnsi="Times New Roman" w:cs="Times New Roman"/>
-          <w:b/>
-          <w:u w:val="single"/>
-        </w:rPr>
-      </w:pPr>
-    </w:p>
+        <w:t>:Edit Book records Form</w:t>
+      </w:r>
+    </w:p>
+    <w:p/>
     <w:p>
       <w:pPr>
         <w:keepNext/>
@@ -10381,8 +10225,8 @@
         </w:rPr>
         <w:drawing>
           <wp:inline distT="0" distB="0" distL="0" distR="0" wp14:anchorId="02486109" wp14:editId="2DBF3C56">
-            <wp:extent cx="5943600" cy="2388870"/>
-            <wp:effectExtent l="0" t="0" r="0" b="0"/>
+            <wp:extent cx="5942099" cy="2525917"/>
+            <wp:effectExtent l="0" t="0" r="1905" b="8255"/>
             <wp:docPr id="36" name="Picture 36"/>
             <wp:cNvGraphicFramePr>
               <a:graphicFrameLocks xmlns:a="http://schemas.openxmlformats.org/drawingml/2006/main" noChangeAspect="1"/>
@@ -10403,7 +10247,7 @@
                   <pic:spPr>
                     <a:xfrm>
                       <a:off x="0" y="0"/>
-                      <a:ext cx="5943600" cy="2388870"/>
+                      <a:ext cx="5956240" cy="2531928"/>
                     </a:xfrm>
                     <a:prstGeom prst="rect">
                       <a:avLst/>
@@ -10503,7 +10347,13 @@
         <w:rPr>
           <w:rFonts w:ascii="Times New Roman" w:hAnsi="Times New Roman" w:cs="Times New Roman"/>
         </w:rPr>
-        <w:t>: Fetch Block in edit_</w:t>
+        <w:t xml:space="preserve">: </w:t>
+      </w:r>
+      <w:r>
+        <w:rPr>
+          <w:rFonts w:ascii="Times New Roman" w:hAnsi="Times New Roman" w:cs="Times New Roman"/>
+        </w:rPr>
+        <w:t xml:space="preserve"> edit_</w:t>
       </w:r>
       <w:r>
         <w:rPr>
@@ -10517,7 +10367,21 @@
           <w:rFonts w:ascii="Times New Roman" w:hAnsi="Times New Roman" w:cs="Times New Roman"/>
           <w:noProof/>
         </w:rPr>
-        <w:t xml:space="preserve"> to edit Record in Admin Dashboard</w:t>
+        <w:t xml:space="preserve"> script</w:t>
+      </w:r>
+      <w:r>
+        <w:rPr>
+          <w:rFonts w:ascii="Times New Roman" w:hAnsi="Times New Roman" w:cs="Times New Roman"/>
+          <w:noProof/>
+        </w:rPr>
+        <w:t xml:space="preserve"> lines</w:t>
+      </w:r>
+      <w:r>
+        <w:rPr>
+          <w:rFonts w:ascii="Times New Roman" w:hAnsi="Times New Roman" w:cs="Times New Roman"/>
+          <w:noProof/>
+        </w:rPr>
+        <w:t xml:space="preserve"> that fetches the Book record to fill the edit Form.</w:t>
       </w:r>
     </w:p>
     <w:p>
@@ -10533,6 +10397,7 @@
           <w:noProof/>
           <w:u w:val="single"/>
         </w:rPr>
+        <w:lastRenderedPageBreak/>
         <w:drawing>
           <wp:inline distT="0" distB="0" distL="0" distR="0" wp14:anchorId="77075687" wp14:editId="54040EF5">
             <wp:extent cx="5943600" cy="4052570"/>
@@ -10575,7 +10440,6 @@
         <w:pStyle w:val="Caption"/>
         <w:rPr>
           <w:rFonts w:ascii="Times New Roman" w:hAnsi="Times New Roman" w:cs="Times New Roman"/>
-          <w:u w:val="single"/>
         </w:rPr>
       </w:pPr>
       <w:r>
@@ -10656,7 +10520,101 @@
         <w:rPr>
           <w:rFonts w:ascii="Times New Roman" w:hAnsi="Times New Roman" w:cs="Times New Roman"/>
         </w:rPr>
-        <w:t>: Catch block for edit button on Admin Dashboard</w:t>
+        <w:t>: edit_record.php ; UPDATE records prepared statements.</w:t>
+      </w:r>
+    </w:p>
+    <w:p>
+      <w:pPr>
+        <w:keepNext/>
+      </w:pPr>
+      <w:bookmarkStart w:id="74" w:name="_GoBack"/>
+      <w:r>
+        <w:drawing>
+          <wp:inline distT="0" distB="0" distL="0" distR="0" wp14:anchorId="78C3CBA7" wp14:editId="256AAAAE">
+            <wp:extent cx="5943600" cy="557530"/>
+            <wp:effectExtent l="0" t="0" r="0" b="0"/>
+            <wp:docPr id="56" name="Picture 56"/>
+            <wp:cNvGraphicFramePr>
+              <a:graphicFrameLocks xmlns:a="http://schemas.openxmlformats.org/drawingml/2006/main" noChangeAspect="1"/>
+            </wp:cNvGraphicFramePr>
+            <a:graphic xmlns:a="http://schemas.openxmlformats.org/drawingml/2006/main">
+              <a:graphicData uri="http://schemas.openxmlformats.org/drawingml/2006/picture">
+                <pic:pic xmlns:pic="http://schemas.openxmlformats.org/drawingml/2006/picture">
+                  <pic:nvPicPr>
+                    <pic:cNvPr id="1" name=""/>
+                    <pic:cNvPicPr/>
+                  </pic:nvPicPr>
+                  <pic:blipFill>
+                    <a:blip r:embed="rId46"/>
+                    <a:stretch>
+                      <a:fillRect/>
+                    </a:stretch>
+                  </pic:blipFill>
+                  <pic:spPr>
+                    <a:xfrm>
+                      <a:off x="0" y="0"/>
+                      <a:ext cx="5943600" cy="557530"/>
+                    </a:xfrm>
+                    <a:prstGeom prst="rect">
+                      <a:avLst/>
+                    </a:prstGeom>
+                  </pic:spPr>
+                </pic:pic>
+              </a:graphicData>
+            </a:graphic>
+          </wp:inline>
+        </w:drawing>
+      </w:r>
+      <w:bookmarkEnd w:id="74"/>
+    </w:p>
+    <w:p>
+      <w:pPr>
+        <w:pStyle w:val="Caption"/>
+      </w:pPr>
+      <w:r>
+        <w:t xml:space="preserve">Figure </w:t>
+      </w:r>
+      <w:r>
+        <w:fldChar w:fldCharType="begin"/>
+      </w:r>
+      <w:r>
+        <w:instrText xml:space="preserve"> STYLEREF 1 \s </w:instrText>
+      </w:r>
+      <w:r>
+        <w:fldChar w:fldCharType="separate"/>
+      </w:r>
+      <w:r>
+        <w:rPr>
+          <w:noProof/>
+        </w:rPr>
+        <w:t>0</w:t>
+      </w:r>
+      <w:r>
+        <w:fldChar w:fldCharType="end"/>
+      </w:r>
+      <w:r>
+        <w:noBreakHyphen/>
+      </w:r>
+      <w:r>
+        <w:fldChar w:fldCharType="begin"/>
+      </w:r>
+      <w:r>
+        <w:instrText xml:space="preserve"> SEQ Figure \* ARABIC \s 1 </w:instrText>
+      </w:r>
+      <w:r>
+        <w:fldChar w:fldCharType="separate"/>
+      </w:r>
+      <w:r>
+        <w:rPr>
+          <w:noProof/>
+        </w:rPr>
+        <w:t>11</w:t>
+      </w:r>
+      <w:r>
+        <w:fldChar w:fldCharType="end"/>
+      </w:r>
+      <w:r>
+        <w:t>; Flash message showing Successful Update</w:t>
       </w:r>
     </w:p>
     <w:p>
@@ -10696,7 +10654,7 @@
           <w:u w:val="single"/>
         </w:rPr>
       </w:pPr>
-      <w:bookmarkStart w:id="73" w:name="_Toc232162148"/>
+      <w:bookmarkStart w:id="75" w:name="_Toc232162148"/>
       <w:r>
         <w:rPr>
           <w:rFonts w:ascii="Times New Roman" w:hAnsi="Times New Roman" w:cs="Times New Roman"/>
@@ -10704,10 +10662,9 @@
           <w:color w:val="000000" w:themeColor="text1"/>
           <w:u w:val="single"/>
         </w:rPr>
-        <w:lastRenderedPageBreak/>
         <w:t>REFLECTION</w:t>
       </w:r>
-      <w:bookmarkEnd w:id="73"/>
+      <w:bookmarkEnd w:id="75"/>
       <w:r>
         <w:rPr>
           <w:rFonts w:ascii="Times New Roman" w:hAnsi="Times New Roman" w:cs="Times New Roman"/>
@@ -10722,99 +10679,63 @@
       <w:pPr>
         <w:rPr>
           <w:rFonts w:ascii="Times New Roman" w:hAnsi="Times New Roman" w:cs="Times New Roman"/>
+        </w:rPr>
+      </w:pPr>
+      <w:r>
+        <w:rPr>
+          <w:rFonts w:ascii="Times New Roman" w:hAnsi="Times New Roman" w:cs="Times New Roman"/>
+        </w:rPr>
+        <w:t>Fig 0_7</w:t>
+      </w:r>
+      <w:r>
+        <w:rPr>
+          <w:rFonts w:ascii="Times New Roman" w:hAnsi="Times New Roman" w:cs="Times New Roman"/>
+        </w:rPr>
+        <w:t xml:space="preserve"> shows the prepared statement (line 13-15) that selects the records from the database </w:t>
+      </w:r>
+      <w:r>
+        <w:rPr>
+          <w:rFonts w:ascii="Times New Roman" w:hAnsi="Times New Roman" w:cs="Times New Roman"/>
+        </w:rPr>
+        <w:t xml:space="preserve">reflects them in the Edit Form . The </w:t>
+      </w:r>
+      <w:r>
+        <w:rPr>
+          <w:rFonts w:ascii="Times New Roman" w:hAnsi="Times New Roman" w:cs="Times New Roman"/>
+          <w:i/>
+          <w:color w:val="FF0000"/>
+        </w:rPr>
+        <w:t>UPDATE Books..</w:t>
+      </w:r>
+      <w:r>
+        <w:rPr>
+          <w:rFonts w:ascii="Times New Roman" w:hAnsi="Times New Roman" w:cs="Times New Roman"/>
+          <w:color w:val="000000" w:themeColor="text1"/>
+        </w:rPr>
+        <w:t>prepared statement</w:t>
+      </w:r>
+      <w:r>
+        <w:rPr>
+          <w:rFonts w:ascii="Times New Roman" w:hAnsi="Times New Roman" w:cs="Times New Roman"/>
+        </w:rPr>
+        <w:t>(line40-49) send the updated records back to the databa</w:t>
+      </w:r>
+      <w:r>
+        <w:rPr>
+          <w:rFonts w:ascii="Times New Roman" w:hAnsi="Times New Roman" w:cs="Times New Roman"/>
+        </w:rPr>
+        <w:t>se and ensures it reflects in the Product List</w:t>
+      </w:r>
+    </w:p>
+    <w:p>
+      <w:pPr>
+        <w:rPr>
+          <w:rFonts w:ascii="Times New Roman" w:hAnsi="Times New Roman" w:cs="Times New Roman"/>
           <w:b/>
           <w:color w:val="000000" w:themeColor="text1"/>
           <w:u w:val="single"/>
         </w:rPr>
       </w:pPr>
-      <w:r>
-        <w:rPr>
-          <w:rFonts w:ascii="Times New Roman" w:hAnsi="Times New Roman" w:cs="Times New Roman"/>
-        </w:rPr>
-        <w:t>Used pdo queries to communicate with the datab</w:t>
-      </w:r>
-      <w:r>
-        <w:rPr>
-          <w:rFonts w:ascii="Times New Roman" w:hAnsi="Times New Roman" w:cs="Times New Roman"/>
-        </w:rPr>
-        <w:t>a</w:t>
-      </w:r>
-      <w:r>
-        <w:rPr>
-          <w:rFonts w:ascii="Times New Roman" w:hAnsi="Times New Roman" w:cs="Times New Roman"/>
-        </w:rPr>
-        <w:t xml:space="preserve">se. </w:t>
-      </w:r>
-      <w:r>
-        <w:rPr>
-          <w:rFonts w:ascii="Times New Roman" w:hAnsi="Times New Roman" w:cs="Times New Roman"/>
-          <w:b/>
-        </w:rPr>
-        <w:t>Fig 0_9</w:t>
-      </w:r>
-      <w:r>
-        <w:rPr>
-          <w:rFonts w:ascii="Times New Roman" w:hAnsi="Times New Roman" w:cs="Times New Roman"/>
-        </w:rPr>
-        <w:t xml:space="preserve"> and </w:t>
-      </w:r>
-      <w:r>
-        <w:rPr>
-          <w:rFonts w:ascii="Times New Roman" w:hAnsi="Times New Roman" w:cs="Times New Roman"/>
-          <w:b/>
-        </w:rPr>
-        <w:t>Fig</w:t>
-      </w:r>
-      <w:r>
-        <w:rPr>
-          <w:rFonts w:ascii="Times New Roman" w:hAnsi="Times New Roman" w:cs="Times New Roman"/>
-          <w:b/>
-        </w:rPr>
-        <w:t xml:space="preserve"> 0_10</w:t>
-      </w:r>
-      <w:r>
-        <w:rPr>
-          <w:rFonts w:ascii="Times New Roman" w:hAnsi="Times New Roman" w:cs="Times New Roman"/>
-        </w:rPr>
-        <w:t xml:space="preserve"> show the fetch catch block (respectfully)</w:t>
-      </w:r>
-      <w:r>
-        <w:rPr>
-          <w:rFonts w:ascii="Times New Roman" w:hAnsi="Times New Roman" w:cs="Times New Roman"/>
-        </w:rPr>
-        <w:t>. The fetch block fetches this information from decorum_bookshop database enabling the Admin to edit the records in the edit book form, The Catch block processes the new records and ensures it reflects in the database and Products List .</w:t>
-      </w:r>
-      <w:r>
-        <w:rPr>
-          <w:rFonts w:ascii="Times New Roman" w:hAnsi="Times New Roman" w:cs="Times New Roman"/>
-        </w:rPr>
-        <w:t xml:space="preserve"> The PDO query </w:t>
-      </w:r>
-      <w:r>
-        <w:rPr>
-          <w:rFonts w:ascii="Times New Roman" w:hAnsi="Times New Roman" w:cs="Times New Roman"/>
-          <w:b/>
-        </w:rPr>
-        <w:t xml:space="preserve">(line 40-45; Fig_10), </w:t>
-      </w:r>
-      <w:r>
-        <w:rPr>
-          <w:rFonts w:ascii="Times New Roman" w:hAnsi="Times New Roman" w:cs="Times New Roman"/>
-        </w:rPr>
-        <w:t xml:space="preserve">updates the records in the Database </w:t>
-      </w:r>
-      <w:r>
-        <w:rPr>
-          <w:rFonts w:ascii="Times New Roman" w:hAnsi="Times New Roman" w:cs="Times New Roman"/>
-        </w:rPr>
-        <w:t>.</w:t>
-      </w:r>
-      <w:r>
-        <w:rPr>
-          <w:rFonts w:ascii="Times New Roman" w:hAnsi="Times New Roman" w:cs="Times New Roman"/>
-        </w:rPr>
-        <w:br/>
-      </w:r>
       <w:r>
         <w:rPr>
           <w:rFonts w:ascii="Times New Roman" w:hAnsi="Times New Roman" w:cs="Times New Roman"/>
@@ -10863,6 +10784,7 @@
           <w:szCs w:val="52"/>
           <w:u w:val="single"/>
         </w:rPr>
+        <w:lastRenderedPageBreak/>
         <w:t>WEEK 6</w:t>
       </w:r>
     </w:p>
@@ -10903,9 +10825,7 @@
     </w:p>
     <w:p>
       <w:pPr>
-        <w:rPr>
-          <w:rFonts w:ascii="Times New Roman" w:hAnsi="Times New Roman" w:cs="Times New Roman"/>
-        </w:rPr>
+        <w:keepNext/>
       </w:pPr>
       <w:r>
         <w:rPr>
@@ -10913,29 +10833,1243 @@
         </w:rPr>
         <w:t xml:space="preserve">  </w:t>
       </w:r>
-    </w:p>
-    <w:p>
-      <w:pPr>
-        <w:rPr>
-          <w:rFonts w:ascii="Times New Roman" w:hAnsi="Times New Roman" w:cs="Times New Roman"/>
-        </w:rPr>
-      </w:pPr>
-    </w:p>
-    <w:p>
-      <w:pPr>
-        <w:rPr>
-          <w:rFonts w:ascii="Times New Roman" w:hAnsi="Times New Roman" w:cs="Times New Roman"/>
-        </w:rPr>
-      </w:pPr>
-      <w:bookmarkStart w:id="74" w:name="_GoBack"/>
-      <w:bookmarkEnd w:id="74"/>
-    </w:p>
-    <w:p>
-      <w:pPr>
-        <w:rPr>
-          <w:rFonts w:ascii="Times New Roman" w:hAnsi="Times New Roman" w:cs="Times New Roman"/>
-        </w:rPr>
-      </w:pPr>
+      <w:r>
+        <w:rPr>
+          <w:rFonts w:ascii="Times New Roman" w:hAnsi="Times New Roman" w:cs="Times New Roman"/>
+        </w:rPr>
+        <w:drawing>
+          <wp:inline distT="0" distB="0" distL="0" distR="0" wp14:anchorId="2FA2E70F" wp14:editId="051CA5D7">
+            <wp:extent cx="5943600" cy="2954216"/>
+            <wp:effectExtent l="0" t="0" r="0" b="0"/>
+            <wp:docPr id="40" name="Picture 40"/>
+            <wp:cNvGraphicFramePr>
+              <a:graphicFrameLocks xmlns:a="http://schemas.openxmlformats.org/drawingml/2006/main" noChangeAspect="1"/>
+            </wp:cNvGraphicFramePr>
+            <a:graphic xmlns:a="http://schemas.openxmlformats.org/drawingml/2006/main">
+              <a:graphicData uri="http://schemas.openxmlformats.org/drawingml/2006/picture">
+                <pic:pic xmlns:pic="http://schemas.openxmlformats.org/drawingml/2006/picture">
+                  <pic:nvPicPr>
+                    <pic:cNvPr id="1" name=""/>
+                    <pic:cNvPicPr/>
+                  </pic:nvPicPr>
+                  <pic:blipFill>
+                    <a:blip r:embed="rId47"/>
+                    <a:stretch>
+                      <a:fillRect/>
+                    </a:stretch>
+                  </pic:blipFill>
+                  <pic:spPr>
+                    <a:xfrm>
+                      <a:off x="0" y="0"/>
+                      <a:ext cx="5944383" cy="2954605"/>
+                    </a:xfrm>
+                    <a:prstGeom prst="rect">
+                      <a:avLst/>
+                    </a:prstGeom>
+                  </pic:spPr>
+                </pic:pic>
+              </a:graphicData>
+            </a:graphic>
+          </wp:inline>
+        </w:drawing>
+      </w:r>
+    </w:p>
+    <w:p>
+      <w:pPr>
+        <w:pStyle w:val="Caption"/>
+      </w:pPr>
+      <w:r>
+        <w:t xml:space="preserve">Figure </w:t>
+      </w:r>
+      <w:r>
+        <w:fldChar w:fldCharType="begin"/>
+      </w:r>
+      <w:r>
+        <w:instrText xml:space="preserve"> STYLEREF 1 \s </w:instrText>
+      </w:r>
+      <w:r>
+        <w:fldChar w:fldCharType="separate"/>
+      </w:r>
+      <w:r>
+        <w:rPr>
+          <w:noProof/>
+        </w:rPr>
+        <w:t>0</w:t>
+      </w:r>
+      <w:r>
+        <w:fldChar w:fldCharType="end"/>
+      </w:r>
+      <w:r>
+        <w:noBreakHyphen/>
+      </w:r>
+      <w:r>
+        <w:fldChar w:fldCharType="begin"/>
+      </w:r>
+      <w:r>
+        <w:instrText xml:space="preserve"> SEQ Figure \* ARABIC \s 1 </w:instrText>
+      </w:r>
+      <w:r>
+        <w:fldChar w:fldCharType="separate"/>
+      </w:r>
+      <w:r>
+        <w:rPr>
+          <w:noProof/>
+        </w:rPr>
+        <w:t>1</w:t>
+      </w:r>
+      <w:r>
+        <w:fldChar w:fldCharType="end"/>
+      </w:r>
+      <w:r>
+        <w:t>:Datab</w:t>
+      </w:r>
+      <w:r>
+        <w:t>a</w:t>
+      </w:r>
+      <w:r>
+        <w:t>se Connection Script</w:t>
+      </w:r>
+    </w:p>
+    <w:p>
+      <w:pPr>
+        <w:keepNext/>
+      </w:pPr>
+      <w:r>
+        <w:drawing>
+          <wp:inline distT="0" distB="0" distL="0" distR="0" wp14:anchorId="1BC4B110" wp14:editId="01261CDB">
+            <wp:extent cx="5943600" cy="1332230"/>
+            <wp:effectExtent l="0" t="0" r="0" b="1270"/>
+            <wp:docPr id="47" name="Picture 47"/>
+            <wp:cNvGraphicFramePr>
+              <a:graphicFrameLocks xmlns:a="http://schemas.openxmlformats.org/drawingml/2006/main" noChangeAspect="1"/>
+            </wp:cNvGraphicFramePr>
+            <a:graphic xmlns:a="http://schemas.openxmlformats.org/drawingml/2006/main">
+              <a:graphicData uri="http://schemas.openxmlformats.org/drawingml/2006/picture">
+                <pic:pic xmlns:pic="http://schemas.openxmlformats.org/drawingml/2006/picture">
+                  <pic:nvPicPr>
+                    <pic:cNvPr id="1" name=""/>
+                    <pic:cNvPicPr/>
+                  </pic:nvPicPr>
+                  <pic:blipFill>
+                    <a:blip r:embed="rId48"/>
+                    <a:stretch>
+                      <a:fillRect/>
+                    </a:stretch>
+                  </pic:blipFill>
+                  <pic:spPr>
+                    <a:xfrm>
+                      <a:off x="0" y="0"/>
+                      <a:ext cx="5943600" cy="1332230"/>
+                    </a:xfrm>
+                    <a:prstGeom prst="rect">
+                      <a:avLst/>
+                    </a:prstGeom>
+                  </pic:spPr>
+                </pic:pic>
+              </a:graphicData>
+            </a:graphic>
+          </wp:inline>
+        </w:drawing>
+      </w:r>
+    </w:p>
+    <w:p>
+      <w:pPr>
+        <w:pStyle w:val="Caption"/>
+      </w:pPr>
+      <w:r>
+        <w:t xml:space="preserve">Figure </w:t>
+      </w:r>
+      <w:r>
+        <w:fldChar w:fldCharType="begin"/>
+      </w:r>
+      <w:r>
+        <w:instrText xml:space="preserve"> STYLEREF 1 \s </w:instrText>
+      </w:r>
+      <w:r>
+        <w:fldChar w:fldCharType="separate"/>
+      </w:r>
+      <w:r>
+        <w:rPr>
+          <w:noProof/>
+        </w:rPr>
+        <w:t>0</w:t>
+      </w:r>
+      <w:r>
+        <w:fldChar w:fldCharType="end"/>
+      </w:r>
+      <w:r>
+        <w:noBreakHyphen/>
+      </w:r>
+      <w:r>
+        <w:fldChar w:fldCharType="begin"/>
+      </w:r>
+      <w:r>
+        <w:instrText xml:space="preserve"> SEQ Figure \* ARABIC \s 1 </w:instrText>
+      </w:r>
+      <w:r>
+        <w:fldChar w:fldCharType="separate"/>
+      </w:r>
+      <w:r>
+        <w:rPr>
+          <w:noProof/>
+        </w:rPr>
+        <w:t>2</w:t>
+      </w:r>
+      <w:r>
+        <w:fldChar w:fldCharType="end"/>
+      </w:r>
+      <w:r>
+        <w:t>: Connection script file inclusion</w:t>
+      </w:r>
+    </w:p>
+    <w:p>
+      <w:pPr>
+        <w:rPr>
+          <w:color w:val="000000" w:themeColor="text1"/>
+        </w:rPr>
+      </w:pPr>
+      <w:r>
+        <w:t>Modularization- Seperated the database connection into its own dedicated  file creating a Module that is pulled into t</w:t>
+      </w:r>
+      <w:r>
+        <w:t>he other pages(File Inclusion) u</w:t>
+      </w:r>
+      <w:r>
+        <w:t xml:space="preserve">sing the </w:t>
+      </w:r>
+      <w:r>
+        <w:rPr>
+          <w:i/>
+          <w:color w:val="FF0000"/>
+        </w:rPr>
+        <w:t>require_once__DIR__</w:t>
+      </w:r>
+      <w:r>
+        <w:rPr>
+          <w:color w:val="FF0000"/>
+        </w:rPr>
+        <w:t xml:space="preserve"> </w:t>
+      </w:r>
+      <w:r>
+        <w:rPr>
+          <w:color w:val="000000" w:themeColor="text1"/>
+        </w:rPr>
+        <w:t>method</w:t>
+      </w:r>
+    </w:p>
+    <w:p>
+      <w:pPr>
+        <w:rPr>
+          <w:color w:val="000000" w:themeColor="text1"/>
+        </w:rPr>
+      </w:pPr>
+      <w:r>
+        <w:rPr>
+          <w:rFonts w:ascii="Times New Roman" w:hAnsi="Times New Roman" w:cs="Times New Roman"/>
+        </w:rPr>
+        <w:lastRenderedPageBreak/>
+        <w:drawing>
+          <wp:inline distT="0" distB="0" distL="0" distR="0" wp14:anchorId="291739A8" wp14:editId="7B0BBBB8">
+            <wp:extent cx="5943415" cy="3587262"/>
+            <wp:effectExtent l="0" t="0" r="635" b="0"/>
+            <wp:docPr id="43" name="Picture 43"/>
+            <wp:cNvGraphicFramePr>
+              <a:graphicFrameLocks xmlns:a="http://schemas.openxmlformats.org/drawingml/2006/main" noChangeAspect="1"/>
+            </wp:cNvGraphicFramePr>
+            <a:graphic xmlns:a="http://schemas.openxmlformats.org/drawingml/2006/main">
+              <a:graphicData uri="http://schemas.openxmlformats.org/drawingml/2006/picture">
+                <pic:pic xmlns:pic="http://schemas.openxmlformats.org/drawingml/2006/picture">
+                  <pic:nvPicPr>
+                    <pic:cNvPr id="1" name=""/>
+                    <pic:cNvPicPr/>
+                  </pic:nvPicPr>
+                  <pic:blipFill>
+                    <a:blip r:embed="rId49"/>
+                    <a:stretch>
+                      <a:fillRect/>
+                    </a:stretch>
+                  </pic:blipFill>
+                  <pic:spPr>
+                    <a:xfrm>
+                      <a:off x="0" y="0"/>
+                      <a:ext cx="5949357" cy="3590849"/>
+                    </a:xfrm>
+                    <a:prstGeom prst="rect">
+                      <a:avLst/>
+                    </a:prstGeom>
+                  </pic:spPr>
+                </pic:pic>
+              </a:graphicData>
+            </a:graphic>
+          </wp:inline>
+        </w:drawing>
+      </w:r>
+    </w:p>
+    <w:p>
+      <w:pPr>
+        <w:pStyle w:val="Caption"/>
+        <w:rPr>
+          <w:rFonts w:ascii="Times New Roman" w:hAnsi="Times New Roman" w:cs="Times New Roman"/>
+        </w:rPr>
+      </w:pPr>
+      <w:r>
+        <w:rPr>
+          <w:rFonts w:ascii="Times New Roman" w:hAnsi="Times New Roman" w:cs="Times New Roman"/>
+        </w:rPr>
+        <w:t xml:space="preserve">Figure </w:t>
+      </w:r>
+      <w:r>
+        <w:rPr>
+          <w:rFonts w:ascii="Times New Roman" w:hAnsi="Times New Roman" w:cs="Times New Roman"/>
+        </w:rPr>
+        <w:fldChar w:fldCharType="begin"/>
+      </w:r>
+      <w:r>
+        <w:rPr>
+          <w:rFonts w:ascii="Times New Roman" w:hAnsi="Times New Roman" w:cs="Times New Roman"/>
+        </w:rPr>
+        <w:instrText xml:space="preserve"> STYLEREF 1 \s </w:instrText>
+      </w:r>
+      <w:r>
+        <w:rPr>
+          <w:rFonts w:ascii="Times New Roman" w:hAnsi="Times New Roman" w:cs="Times New Roman"/>
+        </w:rPr>
+        <w:fldChar w:fldCharType="separate"/>
+      </w:r>
+      <w:r>
+        <w:rPr>
+          <w:rFonts w:ascii="Times New Roman" w:hAnsi="Times New Roman" w:cs="Times New Roman"/>
+          <w:noProof/>
+        </w:rPr>
+        <w:t>0</w:t>
+      </w:r>
+      <w:r>
+        <w:rPr>
+          <w:rFonts w:ascii="Times New Roman" w:hAnsi="Times New Roman" w:cs="Times New Roman"/>
+        </w:rPr>
+        <w:fldChar w:fldCharType="end"/>
+      </w:r>
+      <w:r>
+        <w:rPr>
+          <w:rFonts w:ascii="Times New Roman" w:hAnsi="Times New Roman" w:cs="Times New Roman"/>
+        </w:rPr>
+        <w:noBreakHyphen/>
+      </w:r>
+      <w:r>
+        <w:rPr>
+          <w:rFonts w:ascii="Times New Roman" w:hAnsi="Times New Roman" w:cs="Times New Roman"/>
+        </w:rPr>
+        <w:fldChar w:fldCharType="begin"/>
+      </w:r>
+      <w:r>
+        <w:rPr>
+          <w:rFonts w:ascii="Times New Roman" w:hAnsi="Times New Roman" w:cs="Times New Roman"/>
+        </w:rPr>
+        <w:instrText xml:space="preserve"> SEQ Figure \* ARABIC \s 1 </w:instrText>
+      </w:r>
+      <w:r>
+        <w:rPr>
+          <w:rFonts w:ascii="Times New Roman" w:hAnsi="Times New Roman" w:cs="Times New Roman"/>
+        </w:rPr>
+        <w:fldChar w:fldCharType="separate"/>
+      </w:r>
+      <w:r>
+        <w:rPr>
+          <w:rFonts w:ascii="Times New Roman" w:hAnsi="Times New Roman" w:cs="Times New Roman"/>
+          <w:noProof/>
+        </w:rPr>
+        <w:t>3</w:t>
+      </w:r>
+      <w:r>
+        <w:rPr>
+          <w:rFonts w:ascii="Times New Roman" w:hAnsi="Times New Roman" w:cs="Times New Roman"/>
+        </w:rPr>
+        <w:fldChar w:fldCharType="end"/>
+      </w:r>
+      <w:r>
+        <w:rPr>
+          <w:rFonts w:ascii="Times New Roman" w:hAnsi="Times New Roman" w:cs="Times New Roman"/>
+        </w:rPr>
+        <w:t>: AddNew Book Form</w:t>
+      </w:r>
+    </w:p>
+    <w:p>
+      <w:pPr>
+        <w:keepNext/>
+      </w:pPr>
+      <w:r>
+        <w:drawing>
+          <wp:inline distT="0" distB="0" distL="0" distR="0" wp14:anchorId="170D8FC6" wp14:editId="324BF971">
+            <wp:extent cx="5943063" cy="3506875"/>
+            <wp:effectExtent l="0" t="0" r="635" b="0"/>
+            <wp:docPr id="42" name="Picture 42"/>
+            <wp:cNvGraphicFramePr>
+              <a:graphicFrameLocks xmlns:a="http://schemas.openxmlformats.org/drawingml/2006/main" noChangeAspect="1"/>
+            </wp:cNvGraphicFramePr>
+            <a:graphic xmlns:a="http://schemas.openxmlformats.org/drawingml/2006/main">
+              <a:graphicData uri="http://schemas.openxmlformats.org/drawingml/2006/picture">
+                <pic:pic xmlns:pic="http://schemas.openxmlformats.org/drawingml/2006/picture">
+                  <pic:nvPicPr>
+                    <pic:cNvPr id="1" name=""/>
+                    <pic:cNvPicPr/>
+                  </pic:nvPicPr>
+                  <pic:blipFill>
+                    <a:blip r:embed="rId50"/>
+                    <a:stretch>
+                      <a:fillRect/>
+                    </a:stretch>
+                  </pic:blipFill>
+                  <pic:spPr>
+                    <a:xfrm>
+                      <a:off x="0" y="0"/>
+                      <a:ext cx="5962210" cy="3518173"/>
+                    </a:xfrm>
+                    <a:prstGeom prst="rect">
+                      <a:avLst/>
+                    </a:prstGeom>
+                  </pic:spPr>
+                </pic:pic>
+              </a:graphicData>
+            </a:graphic>
+          </wp:inline>
+        </w:drawing>
+      </w:r>
+    </w:p>
+    <w:p>
+      <w:pPr>
+        <w:pStyle w:val="Caption"/>
+      </w:pPr>
+      <w:r>
+        <w:t xml:space="preserve">Figure </w:t>
+      </w:r>
+      <w:r>
+        <w:fldChar w:fldCharType="begin"/>
+      </w:r>
+      <w:r>
+        <w:instrText xml:space="preserve"> STYLEREF 1 \s </w:instrText>
+      </w:r>
+      <w:r>
+        <w:fldChar w:fldCharType="separate"/>
+      </w:r>
+      <w:r>
+        <w:rPr>
+          <w:noProof/>
+        </w:rPr>
+        <w:t>0</w:t>
+      </w:r>
+      <w:r>
+        <w:fldChar w:fldCharType="end"/>
+      </w:r>
+      <w:r>
+        <w:noBreakHyphen/>
+      </w:r>
+      <w:r>
+        <w:fldChar w:fldCharType="begin"/>
+      </w:r>
+      <w:r>
+        <w:instrText xml:space="preserve"> SEQ Figure \* ARABIC \s 1 </w:instrText>
+      </w:r>
+      <w:r>
+        <w:fldChar w:fldCharType="separate"/>
+      </w:r>
+      <w:r>
+        <w:rPr>
+          <w:noProof/>
+        </w:rPr>
+        <w:t>4</w:t>
+      </w:r>
+      <w:r>
+        <w:fldChar w:fldCharType="end"/>
+      </w:r>
+      <w:r>
+        <w:t xml:space="preserve">;AddBook </w:t>
+      </w:r>
+      <w:r>
+        <w:t xml:space="preserve"> Form</w:t>
+      </w:r>
+      <w:r>
+        <w:t>PHP script(add_product.php)</w:t>
+      </w:r>
+    </w:p>
+    <w:p>
+      <w:pPr>
+        <w:keepNext/>
+      </w:pPr>
+      <w:r>
+        <w:lastRenderedPageBreak/>
+        <w:drawing>
+          <wp:inline distT="0" distB="0" distL="0" distR="0" wp14:anchorId="3F1E3492" wp14:editId="4921675D">
+            <wp:extent cx="5943600" cy="1376624"/>
+            <wp:effectExtent l="0" t="0" r="0" b="0"/>
+            <wp:docPr id="45" name="Picture 45"/>
+            <wp:cNvGraphicFramePr>
+              <a:graphicFrameLocks xmlns:a="http://schemas.openxmlformats.org/drawingml/2006/main" noChangeAspect="1"/>
+            </wp:cNvGraphicFramePr>
+            <a:graphic xmlns:a="http://schemas.openxmlformats.org/drawingml/2006/main">
+              <a:graphicData uri="http://schemas.openxmlformats.org/drawingml/2006/picture">
+                <pic:pic xmlns:pic="http://schemas.openxmlformats.org/drawingml/2006/picture">
+                  <pic:nvPicPr>
+                    <pic:cNvPr id="1" name=""/>
+                    <pic:cNvPicPr/>
+                  </pic:nvPicPr>
+                  <pic:blipFill>
+                    <a:blip r:embed="rId51"/>
+                    <a:stretch>
+                      <a:fillRect/>
+                    </a:stretch>
+                  </pic:blipFill>
+                  <pic:spPr>
+                    <a:xfrm>
+                      <a:off x="0" y="0"/>
+                      <a:ext cx="5958389" cy="1380049"/>
+                    </a:xfrm>
+                    <a:prstGeom prst="rect">
+                      <a:avLst/>
+                    </a:prstGeom>
+                  </pic:spPr>
+                </pic:pic>
+              </a:graphicData>
+            </a:graphic>
+          </wp:inline>
+        </w:drawing>
+      </w:r>
+    </w:p>
+    <w:p>
+      <w:pPr>
+        <w:pStyle w:val="Caption"/>
+      </w:pPr>
+      <w:r>
+        <w:t xml:space="preserve">Figure </w:t>
+      </w:r>
+      <w:r>
+        <w:fldChar w:fldCharType="begin"/>
+      </w:r>
+      <w:r>
+        <w:instrText xml:space="preserve"> STYLEREF 1 \s </w:instrText>
+      </w:r>
+      <w:r>
+        <w:fldChar w:fldCharType="separate"/>
+      </w:r>
+      <w:r>
+        <w:rPr>
+          <w:noProof/>
+        </w:rPr>
+        <w:t>0</w:t>
+      </w:r>
+      <w:r>
+        <w:fldChar w:fldCharType="end"/>
+      </w:r>
+      <w:r>
+        <w:noBreakHyphen/>
+      </w:r>
+      <w:r>
+        <w:fldChar w:fldCharType="begin"/>
+      </w:r>
+      <w:r>
+        <w:instrText xml:space="preserve"> SEQ Figure \* ARABIC \s 1 </w:instrText>
+      </w:r>
+      <w:r>
+        <w:fldChar w:fldCharType="separate"/>
+      </w:r>
+      <w:r>
+        <w:rPr>
+          <w:noProof/>
+        </w:rPr>
+        <w:t>5</w:t>
+      </w:r>
+      <w:r>
+        <w:fldChar w:fldCharType="end"/>
+      </w:r>
+      <w:r>
+        <w:t xml:space="preserve">; Error </w:t>
+      </w:r>
+      <w:r>
+        <w:t>Message when a saved ISBN</w:t>
+      </w:r>
+      <w:r>
+        <w:t>(Book unique identifier) is enetered</w:t>
+      </w:r>
+    </w:p>
+    <w:p>
+      <w:pPr>
+        <w:pStyle w:val="Caption"/>
+      </w:pPr>
+      <w:r>
+        <w:drawing>
+          <wp:inline distT="0" distB="0" distL="0" distR="0" wp14:anchorId="243BA14E" wp14:editId="5EF9FA77">
+            <wp:extent cx="5942818" cy="1477107"/>
+            <wp:effectExtent l="0" t="0" r="1270" b="8890"/>
+            <wp:docPr id="46" name="Picture 46"/>
+            <wp:cNvGraphicFramePr>
+              <a:graphicFrameLocks xmlns:a="http://schemas.openxmlformats.org/drawingml/2006/main" noChangeAspect="1"/>
+            </wp:cNvGraphicFramePr>
+            <a:graphic xmlns:a="http://schemas.openxmlformats.org/drawingml/2006/main">
+              <a:graphicData uri="http://schemas.openxmlformats.org/drawingml/2006/picture">
+                <pic:pic xmlns:pic="http://schemas.openxmlformats.org/drawingml/2006/picture">
+                  <pic:nvPicPr>
+                    <pic:cNvPr id="1" name=""/>
+                    <pic:cNvPicPr/>
+                  </pic:nvPicPr>
+                  <pic:blipFill>
+                    <a:blip r:embed="rId52"/>
+                    <a:stretch>
+                      <a:fillRect/>
+                    </a:stretch>
+                  </pic:blipFill>
+                  <pic:spPr>
+                    <a:xfrm>
+                      <a:off x="0" y="0"/>
+                      <a:ext cx="5954874" cy="1480104"/>
+                    </a:xfrm>
+                    <a:prstGeom prst="rect">
+                      <a:avLst/>
+                    </a:prstGeom>
+                  </pic:spPr>
+                </pic:pic>
+              </a:graphicData>
+            </a:graphic>
+          </wp:inline>
+        </w:drawing>
+      </w:r>
+      <w:r>
+        <w:t xml:space="preserve">Figure </w:t>
+      </w:r>
+      <w:r>
+        <w:fldChar w:fldCharType="begin"/>
+      </w:r>
+      <w:r>
+        <w:instrText xml:space="preserve"> STYLEREF 1 \s </w:instrText>
+      </w:r>
+      <w:r>
+        <w:fldChar w:fldCharType="separate"/>
+      </w:r>
+      <w:r>
+        <w:rPr>
+          <w:noProof/>
+        </w:rPr>
+        <w:t>0</w:t>
+      </w:r>
+      <w:r>
+        <w:fldChar w:fldCharType="end"/>
+      </w:r>
+      <w:r>
+        <w:noBreakHyphen/>
+      </w:r>
+      <w:r>
+        <w:fldChar w:fldCharType="begin"/>
+      </w:r>
+      <w:r>
+        <w:instrText xml:space="preserve"> SEQ Figure \* ARABIC \s 1 </w:instrText>
+      </w:r>
+      <w:r>
+        <w:fldChar w:fldCharType="separate"/>
+      </w:r>
+      <w:r>
+        <w:rPr>
+          <w:noProof/>
+        </w:rPr>
+        <w:t>6</w:t>
+      </w:r>
+      <w:r>
+        <w:fldChar w:fldCharType="end"/>
+      </w:r>
+      <w:r>
+        <w:t>: New Book Record added(Happy Ever After)</w:t>
+      </w:r>
+      <w:r>
+        <w:t>, after using an usaved ISBN</w:t>
+      </w:r>
+    </w:p>
+    <w:p>
+      <w:pPr>
+        <w:pStyle w:val="Caption"/>
+        <w:keepNext/>
+      </w:pPr>
+      <w:r>
+        <w:rPr>
+          <w:rFonts w:ascii="Times New Roman" w:hAnsi="Times New Roman" w:cs="Times New Roman"/>
+        </w:rPr>
+        <w:br/>
+      </w:r>
+      <w:r>
+        <w:rPr>
+          <w:rFonts w:ascii="Times New Roman" w:hAnsi="Times New Roman" w:cs="Times New Roman"/>
+        </w:rPr>
+        <w:br/>
+      </w:r>
+      <w:r>
+        <w:rPr>
+          <w:rFonts w:ascii="Times New Roman" w:hAnsi="Times New Roman" w:cs="Times New Roman"/>
+        </w:rPr>
+        <w:drawing>
+          <wp:inline distT="0" distB="0" distL="0" distR="0" wp14:anchorId="08B0D324" wp14:editId="637286D3">
+            <wp:extent cx="5940890" cy="2069960"/>
+            <wp:effectExtent l="0" t="0" r="3175" b="6985"/>
+            <wp:docPr id="49" name="Picture 49"/>
+            <wp:cNvGraphicFramePr>
+              <a:graphicFrameLocks xmlns:a="http://schemas.openxmlformats.org/drawingml/2006/main" noChangeAspect="1"/>
+            </wp:cNvGraphicFramePr>
+            <a:graphic xmlns:a="http://schemas.openxmlformats.org/drawingml/2006/main">
+              <a:graphicData uri="http://schemas.openxmlformats.org/drawingml/2006/picture">
+                <pic:pic xmlns:pic="http://schemas.openxmlformats.org/drawingml/2006/picture">
+                  <pic:nvPicPr>
+                    <pic:cNvPr id="1" name=""/>
+                    <pic:cNvPicPr/>
+                  </pic:nvPicPr>
+                  <pic:blipFill>
+                    <a:blip r:embed="rId53"/>
+                    <a:stretch>
+                      <a:fillRect/>
+                    </a:stretch>
+                  </pic:blipFill>
+                  <pic:spPr>
+                    <a:xfrm>
+                      <a:off x="0" y="0"/>
+                      <a:ext cx="5964904" cy="2078327"/>
+                    </a:xfrm>
+                    <a:prstGeom prst="rect">
+                      <a:avLst/>
+                    </a:prstGeom>
+                  </pic:spPr>
+                </pic:pic>
+              </a:graphicData>
+            </a:graphic>
+          </wp:inline>
+        </w:drawing>
+      </w:r>
+    </w:p>
+    <w:p>
+      <w:pPr>
+        <w:pStyle w:val="Caption"/>
+      </w:pPr>
+      <w:r>
+        <w:t xml:space="preserve">Figure </w:t>
+      </w:r>
+      <w:r>
+        <w:fldChar w:fldCharType="begin"/>
+      </w:r>
+      <w:r>
+        <w:instrText xml:space="preserve"> STYLEREF 1 \s </w:instrText>
+      </w:r>
+      <w:r>
+        <w:fldChar w:fldCharType="separate"/>
+      </w:r>
+      <w:r>
+        <w:rPr>
+          <w:noProof/>
+        </w:rPr>
+        <w:t>0</w:t>
+      </w:r>
+      <w:r>
+        <w:fldChar w:fldCharType="end"/>
+      </w:r>
+      <w:r>
+        <w:noBreakHyphen/>
+      </w:r>
+      <w:r>
+        <w:fldChar w:fldCharType="begin"/>
+      </w:r>
+      <w:r>
+        <w:instrText xml:space="preserve"> SEQ Figure \* ARABIC \s 1 </w:instrText>
+      </w:r>
+      <w:r>
+        <w:fldChar w:fldCharType="separate"/>
+      </w:r>
+      <w:r>
+        <w:rPr>
+          <w:noProof/>
+        </w:rPr>
+        <w:t>7</w:t>
+      </w:r>
+      <w:r>
+        <w:fldChar w:fldCharType="end"/>
+      </w:r>
+      <w:r>
+        <w:t>:Delete Button flash message</w:t>
+      </w:r>
+    </w:p>
+    <w:p/>
+    <w:p>
+      <w:pPr>
+        <w:keepNext/>
+      </w:pPr>
+      <w:r>
+        <w:drawing>
+          <wp:inline distT="0" distB="0" distL="0" distR="0" wp14:anchorId="280C3B70" wp14:editId="0439B9F3">
+            <wp:extent cx="5943600" cy="1296237"/>
+            <wp:effectExtent l="0" t="0" r="0" b="0"/>
+            <wp:docPr id="50" name="Picture 50"/>
+            <wp:cNvGraphicFramePr>
+              <a:graphicFrameLocks xmlns:a="http://schemas.openxmlformats.org/drawingml/2006/main" noChangeAspect="1"/>
+            </wp:cNvGraphicFramePr>
+            <a:graphic xmlns:a="http://schemas.openxmlformats.org/drawingml/2006/main">
+              <a:graphicData uri="http://schemas.openxmlformats.org/drawingml/2006/picture">
+                <pic:pic xmlns:pic="http://schemas.openxmlformats.org/drawingml/2006/picture">
+                  <pic:nvPicPr>
+                    <pic:cNvPr id="1" name=""/>
+                    <pic:cNvPicPr/>
+                  </pic:nvPicPr>
+                  <pic:blipFill>
+                    <a:blip r:embed="rId54"/>
+                    <a:stretch>
+                      <a:fillRect/>
+                    </a:stretch>
+                  </pic:blipFill>
+                  <pic:spPr>
+                    <a:xfrm>
+                      <a:off x="0" y="0"/>
+                      <a:ext cx="5957729" cy="1299318"/>
+                    </a:xfrm>
+                    <a:prstGeom prst="rect">
+                      <a:avLst/>
+                    </a:prstGeom>
+                  </pic:spPr>
+                </pic:pic>
+              </a:graphicData>
+            </a:graphic>
+          </wp:inline>
+        </w:drawing>
+      </w:r>
+    </w:p>
+    <w:p>
+      <w:pPr>
+        <w:pStyle w:val="Caption"/>
+      </w:pPr>
+      <w:r>
+        <w:t xml:space="preserve">Figure </w:t>
+      </w:r>
+      <w:r>
+        <w:fldChar w:fldCharType="begin"/>
+      </w:r>
+      <w:r>
+        <w:instrText xml:space="preserve"> STYLEREF 1 \s </w:instrText>
+      </w:r>
+      <w:r>
+        <w:fldChar w:fldCharType="separate"/>
+      </w:r>
+      <w:r>
+        <w:rPr>
+          <w:noProof/>
+        </w:rPr>
+        <w:t>0</w:t>
+      </w:r>
+      <w:r>
+        <w:fldChar w:fldCharType="end"/>
+      </w:r>
+      <w:r>
+        <w:noBreakHyphen/>
+      </w:r>
+      <w:r>
+        <w:fldChar w:fldCharType="begin"/>
+      </w:r>
+      <w:r>
+        <w:instrText xml:space="preserve"> SEQ Figure \* ARABIC \s 1 </w:instrText>
+      </w:r>
+      <w:r>
+        <w:fldChar w:fldCharType="separate"/>
+      </w:r>
+      <w:r>
+        <w:rPr>
+          <w:noProof/>
+        </w:rPr>
+        <w:t>8</w:t>
+      </w:r>
+      <w:r>
+        <w:fldChar w:fldCharType="end"/>
+      </w:r>
+      <w:r>
+        <w:t>;Deleted record(Four Figure Mathematical Tables)</w:t>
+      </w:r>
+    </w:p>
+    <w:p>
+      <w:pPr>
+        <w:keepNext/>
+        <w:rPr>
+          <w:rFonts w:ascii="Times New Roman" w:hAnsi="Times New Roman" w:cs="Times New Roman"/>
+        </w:rPr>
+      </w:pPr>
+    </w:p>
+    <w:p>
+      <w:pPr>
+        <w:keepNext/>
+      </w:pPr>
+      <w:r>
+        <w:rPr>
+          <w:rFonts w:ascii="Times New Roman" w:hAnsi="Times New Roman" w:cs="Times New Roman"/>
+        </w:rPr>
+        <w:drawing>
+          <wp:inline distT="0" distB="0" distL="0" distR="0" wp14:anchorId="57989C0C" wp14:editId="3E8AAB4B">
+            <wp:extent cx="5943600" cy="2120203"/>
+            <wp:effectExtent l="0" t="0" r="0" b="0"/>
+            <wp:docPr id="48" name="Picture 48"/>
+            <wp:cNvGraphicFramePr>
+              <a:graphicFrameLocks xmlns:a="http://schemas.openxmlformats.org/drawingml/2006/main" noChangeAspect="1"/>
+            </wp:cNvGraphicFramePr>
+            <a:graphic xmlns:a="http://schemas.openxmlformats.org/drawingml/2006/main">
+              <a:graphicData uri="http://schemas.openxmlformats.org/drawingml/2006/picture">
+                <pic:pic xmlns:pic="http://schemas.openxmlformats.org/drawingml/2006/picture">
+                  <pic:nvPicPr>
+                    <pic:cNvPr id="1" name=""/>
+                    <pic:cNvPicPr/>
+                  </pic:nvPicPr>
+                  <pic:blipFill>
+                    <a:blip r:embed="rId55"/>
+                    <a:stretch>
+                      <a:fillRect/>
+                    </a:stretch>
+                  </pic:blipFill>
+                  <pic:spPr>
+                    <a:xfrm>
+                      <a:off x="0" y="0"/>
+                      <a:ext cx="5948894" cy="2122092"/>
+                    </a:xfrm>
+                    <a:prstGeom prst="rect">
+                      <a:avLst/>
+                    </a:prstGeom>
+                  </pic:spPr>
+                </pic:pic>
+              </a:graphicData>
+            </a:graphic>
+          </wp:inline>
+        </w:drawing>
+      </w:r>
+    </w:p>
+    <w:p>
+      <w:pPr>
+        <w:pStyle w:val="Caption"/>
+      </w:pPr>
+      <w:r>
+        <w:t xml:space="preserve">Figure </w:t>
+      </w:r>
+      <w:r>
+        <w:fldChar w:fldCharType="begin"/>
+      </w:r>
+      <w:r>
+        <w:instrText xml:space="preserve"> STYLEREF 1 \s </w:instrText>
+      </w:r>
+      <w:r>
+        <w:fldChar w:fldCharType="separate"/>
+      </w:r>
+      <w:r>
+        <w:rPr>
+          <w:noProof/>
+        </w:rPr>
+        <w:t>0</w:t>
+      </w:r>
+      <w:r>
+        <w:fldChar w:fldCharType="end"/>
+      </w:r>
+      <w:r>
+        <w:noBreakHyphen/>
+      </w:r>
+      <w:r>
+        <w:fldChar w:fldCharType="begin"/>
+      </w:r>
+      <w:r>
+        <w:instrText xml:space="preserve"> SEQ Figure \* ARABIC \s 1 </w:instrText>
+      </w:r>
+      <w:r>
+        <w:fldChar w:fldCharType="separate"/>
+      </w:r>
+      <w:r>
+        <w:rPr>
+          <w:noProof/>
+        </w:rPr>
+        <w:t>9</w:t>
+      </w:r>
+      <w:r>
+        <w:fldChar w:fldCharType="end"/>
+      </w:r>
+      <w:r>
+        <w:t>:Delete_product script</w:t>
+      </w:r>
+    </w:p>
+    <w:p>
+      <w:r>
+        <w:drawing>
+          <wp:inline distT="0" distB="0" distL="0" distR="0" wp14:anchorId="0FB27CEE" wp14:editId="09B635EE">
+            <wp:extent cx="5943600" cy="783771"/>
+            <wp:effectExtent l="0" t="0" r="0" b="0"/>
+            <wp:docPr id="51" name="Picture 51"/>
+            <wp:cNvGraphicFramePr>
+              <a:graphicFrameLocks xmlns:a="http://schemas.openxmlformats.org/drawingml/2006/main" noChangeAspect="1"/>
+            </wp:cNvGraphicFramePr>
+            <a:graphic xmlns:a="http://schemas.openxmlformats.org/drawingml/2006/main">
+              <a:graphicData uri="http://schemas.openxmlformats.org/drawingml/2006/picture">
+                <pic:pic xmlns:pic="http://schemas.openxmlformats.org/drawingml/2006/picture">
+                  <pic:nvPicPr>
+                    <pic:cNvPr id="1" name=""/>
+                    <pic:cNvPicPr/>
+                  </pic:nvPicPr>
+                  <pic:blipFill>
+                    <a:blip r:embed="rId56"/>
+                    <a:stretch>
+                      <a:fillRect/>
+                    </a:stretch>
+                  </pic:blipFill>
+                  <pic:spPr>
+                    <a:xfrm>
+                      <a:off x="0" y="0"/>
+                      <a:ext cx="5954530" cy="785212"/>
+                    </a:xfrm>
+                    <a:prstGeom prst="rect">
+                      <a:avLst/>
+                    </a:prstGeom>
+                  </pic:spPr>
+                </pic:pic>
+              </a:graphicData>
+            </a:graphic>
+          </wp:inline>
+        </w:drawing>
+      </w:r>
+    </w:p>
+    <w:p>
+      <w:pPr>
+        <w:rPr>
+          <w:color w:val="000000" w:themeColor="text1"/>
+        </w:rPr>
+      </w:pPr>
+      <w:r>
+        <w:t xml:space="preserve">Use of prepared statement </w:t>
+      </w:r>
+      <w:r>
+        <w:rPr>
+          <w:i/>
+          <w:color w:val="FF0000"/>
+        </w:rPr>
+        <w:t>($stmt = $pdo-&gt;prepare("D</w:t>
+      </w:r>
+      <w:r>
+        <w:rPr>
+          <w:i/>
+          <w:color w:val="FF0000"/>
+        </w:rPr>
+        <w:t xml:space="preserve">ELETE FROM books WHERE id = ?") </w:t>
+      </w:r>
+      <w:r>
+        <w:rPr>
+          <w:color w:val="000000" w:themeColor="text1"/>
+        </w:rPr>
+        <w:t>that provides a place holder for the book data .</w:t>
+      </w:r>
+      <w:r>
+        <w:rPr>
+          <w:color w:val="000000" w:themeColor="text1"/>
+        </w:rPr>
+        <w:t xml:space="preserve"> The </w:t>
+      </w:r>
+      <w:r>
+        <w:t xml:space="preserve"> </w:t>
+      </w:r>
+      <w:r>
+        <w:rPr>
+          <w:i/>
+          <w:color w:val="FF0000"/>
+        </w:rPr>
+        <w:t>if ($stmt-&gt;execute([$_POST['id']])</w:t>
+      </w:r>
+      <w:r>
+        <w:rPr>
+          <w:i/>
+          <w:color w:val="FF0000"/>
+        </w:rPr>
+        <w:t>….l</w:t>
+      </w:r>
+      <w:r>
+        <w:rPr>
+          <w:color w:val="000000" w:themeColor="text1"/>
+        </w:rPr>
+        <w:t>ine binds the prepared statement to the act</w:t>
+      </w:r>
+      <w:r>
+        <w:rPr>
+          <w:color w:val="000000" w:themeColor="text1"/>
+        </w:rPr>
+        <w:t>u</w:t>
+      </w:r>
+      <w:r>
+        <w:rPr>
+          <w:color w:val="000000" w:themeColor="text1"/>
+        </w:rPr>
+        <w:t>al book details and executes it sing METHOD=POST.</w:t>
+      </w:r>
+      <w:r>
+        <w:rPr>
+          <w:i/>
+          <w:color w:val="000000" w:themeColor="text1"/>
+        </w:rPr>
+        <w:t xml:space="preserve"> </w:t>
+      </w:r>
+      <w:r>
+        <w:rPr>
+          <w:color w:val="000000" w:themeColor="text1"/>
+        </w:rPr>
+        <w:t>This tells the databse to delete the record.</w:t>
+      </w:r>
+    </w:p>
+    <w:p>
+      <w:pPr>
+        <w:rPr>
+          <w:color w:val="000000" w:themeColor="text1"/>
+        </w:rPr>
+      </w:pPr>
+      <w:r>
+        <w:rPr>
+          <w:rFonts w:ascii="Times New Roman" w:hAnsi="Times New Roman" w:cs="Times New Roman"/>
+        </w:rPr>
+        <w:br/>
+      </w:r>
+      <w:r>
+        <w:rPr>
+          <w:rFonts w:ascii="Times New Roman" w:hAnsi="Times New Roman" w:cs="Times New Roman"/>
+        </w:rPr>
+        <w:br/>
+      </w:r>
+    </w:p>
+    <w:p>
+      <w:pPr>
+        <w:rPr>
+          <w:b/>
+          <w:u w:val="single"/>
+        </w:rPr>
+      </w:pPr>
+      <w:r>
+        <w:rPr>
+          <w:b/>
+          <w:u w:val="single"/>
+        </w:rPr>
+        <w:t>REFLECTION</w:t>
+      </w:r>
+    </w:p>
+    <w:p>
+      <w:pPr>
+        <w:pStyle w:val="Heading1"/>
+        <w:rPr>
+          <w:rFonts w:ascii="Times New Roman" w:hAnsi="Times New Roman" w:cs="Times New Roman"/>
+          <w:b/>
+          <w:color w:val="000000" w:themeColor="text1"/>
+          <w:sz w:val="52"/>
+          <w:szCs w:val="52"/>
+          <w:u w:val="single"/>
+        </w:rPr>
+      </w:pPr>
+      <w:r>
+        <w:rPr>
+          <w:rFonts w:ascii="Times New Roman" w:hAnsi="Times New Roman" w:cs="Times New Roman"/>
+          <w:b/>
+          <w:color w:val="000000" w:themeColor="text1"/>
+          <w:sz w:val="52"/>
+          <w:szCs w:val="52"/>
+          <w:u w:val="single"/>
+        </w:rPr>
+        <w:lastRenderedPageBreak/>
+        <w:t>WEEK 7</w:t>
+      </w:r>
+    </w:p>
+    <w:p>
+      <w:pPr>
+        <w:pStyle w:val="Heading1"/>
+        <w:rPr>
+          <w:rFonts w:ascii="Times New Roman" w:hAnsi="Times New Roman" w:cs="Times New Roman"/>
+          <w:b/>
+          <w:color w:val="000000" w:themeColor="text1"/>
+          <w:sz w:val="52"/>
+          <w:szCs w:val="52"/>
+        </w:rPr>
+      </w:pPr>
+      <w:r>
+        <w:rPr>
+          <w:rFonts w:ascii="Times New Roman" w:eastAsia="Times New Roman" w:hAnsi="Times New Roman" w:cs="Times New Roman"/>
+          <w:b/>
+          <w:bCs/>
+          <w:color w:val="auto"/>
+          <w:kern w:val="36"/>
+          <w:sz w:val="36"/>
+          <w:szCs w:val="36"/>
+          <w:u w:val="single"/>
+        </w:rPr>
+        <w:t>User Authentication and Session Management</w:t>
+      </w:r>
+      <w:r>
+        <w:rPr>
+          <w:rFonts w:ascii="Times New Roman" w:hAnsi="Times New Roman" w:cs="Times New Roman"/>
+          <w:b/>
+          <w:color w:val="000000" w:themeColor="text1"/>
+          <w:sz w:val="52"/>
+          <w:szCs w:val="52"/>
+        </w:rPr>
+        <w:br/>
+      </w:r>
+      <w:r>
+        <w:rPr>
+          <w:rFonts w:ascii="Times New Roman" w:hAnsi="Times New Roman" w:cs="Times New Roman"/>
+          <w:b/>
+          <w:color w:val="000000" w:themeColor="text1"/>
+          <w:sz w:val="52"/>
+          <w:szCs w:val="52"/>
+        </w:rPr>
+        <w:drawing>
+          <wp:inline distT="0" distB="0" distL="0" distR="0" wp14:anchorId="1470E269" wp14:editId="00A76426">
+            <wp:extent cx="5277587" cy="2086266"/>
+            <wp:effectExtent l="0" t="0" r="0" b="9525"/>
+            <wp:docPr id="39" name="Picture 39"/>
+            <wp:cNvGraphicFramePr>
+              <a:graphicFrameLocks xmlns:a="http://schemas.openxmlformats.org/drawingml/2006/main" noChangeAspect="1"/>
+            </wp:cNvGraphicFramePr>
+            <a:graphic xmlns:a="http://schemas.openxmlformats.org/drawingml/2006/main">
+              <a:graphicData uri="http://schemas.openxmlformats.org/drawingml/2006/picture">
+                <pic:pic xmlns:pic="http://schemas.openxmlformats.org/drawingml/2006/picture">
+                  <pic:nvPicPr>
+                    <pic:cNvPr id="1" name=""/>
+                    <pic:cNvPicPr/>
+                  </pic:nvPicPr>
+                  <pic:blipFill>
+                    <a:blip r:embed="rId57"/>
+                    <a:stretch>
+                      <a:fillRect/>
+                    </a:stretch>
+                  </pic:blipFill>
+                  <pic:spPr>
+                    <a:xfrm>
+                      <a:off x="0" y="0"/>
+                      <a:ext cx="5277587" cy="2086266"/>
+                    </a:xfrm>
+                    <a:prstGeom prst="rect">
+                      <a:avLst/>
+                    </a:prstGeom>
+                  </pic:spPr>
+                </pic:pic>
+              </a:graphicData>
+            </a:graphic>
+          </wp:inline>
+        </w:drawing>
+      </w:r>
+    </w:p>
+    <w:p>
+      <w:pPr>
+        <w:rPr>
+          <w:rFonts w:ascii="Times New Roman" w:hAnsi="Times New Roman" w:cs="Times New Roman"/>
+        </w:rPr>
+      </w:pPr>
+      <w:r>
+        <w:rPr>
+          <w:rFonts w:ascii="Times New Roman" w:hAnsi="Times New Roman" w:cs="Times New Roman"/>
+        </w:rPr>
+        <w:t>Screenshot to show To use The Manager Index.php page, it requires Log in, Managerial credentials</w:t>
+      </w:r>
+      <w:r>
+        <w:rPr>
+          <w:rFonts w:ascii="Times New Roman" w:hAnsi="Times New Roman" w:cs="Times New Roman"/>
+        </w:rPr>
+        <w:t>.</w:t>
+      </w:r>
+      <w:r>
+        <w:rPr>
+          <w:rFonts w:ascii="Times New Roman" w:hAnsi="Times New Roman" w:cs="Times New Roman"/>
+        </w:rPr>
+        <w:br/>
+        <w:t xml:space="preserve">The Header (Cache-Control), is HTTP that instructs the browser not to Cache the page. To always validate the page, every time a user log is </w:t>
+      </w:r>
     </w:p>
     <w:sectPr>
       <w:pgSz w:w="12240" w:h="15840"/>
@@ -12605,7 +13739,6 @@
   <w:style w:type="character" w:default="1" w:styleId="DefaultParagraphFont">
     <w:name w:val="Default Paragraph Font"/>
     <w:uiPriority w:val="1"/>
-    <w:semiHidden/>
     <w:unhideWhenUsed/>
   </w:style>
   <w:style w:type="table" w:default="1" w:styleId="TableNormal">
@@ -13110,7 +14243,7 @@
 </file>
 
 <file path=customXml/itemProps1.xml><?xml version="1.0" encoding="utf-8"?>
-<ds:datastoreItem xmlns:ds="http://schemas.openxmlformats.org/officeDocument/2006/customXml" ds:itemID="{435271DB-A486-4D1C-A086-30F995E89439}">
+<ds:datastoreItem xmlns:ds="http://schemas.openxmlformats.org/officeDocument/2006/customXml" ds:itemID="{9F60CBC8-8BDA-432F-B4B4-BEA5421FF09A}">
   <ds:schemaRefs>
     <ds:schemaRef ds:uri="http://schemas.openxmlformats.org/officeDocument/2006/bibliography"/>
   </ds:schemaRefs>

</xml_diff>